<commit_message>
Caso de uso expandido
</commit_message>
<xml_diff>
--- a/essencial receitas.docx
+++ b/essencial receitas.docx
@@ -4025,16 +4025,6 @@
     </w:p>
     <w:p>
       <w:pPr>
-        <w:rPr/>
-      </w:pPr>
-      <w:r>
-        <w:rPr>
-          <w:rtl w:val="0"/>
-        </w:rPr>
-      </w:r>
-    </w:p>
-    <w:p>
-      <w:pPr>
         <w:spacing w:line="360" w:lineRule="auto"/>
         <w:jc w:val="both"/>
         <w:rPr>
@@ -5663,7 +5653,10 @@
       <w:pPr>
         <w:spacing w:line="360" w:lineRule="auto"/>
         <w:jc w:val="both"/>
-        <w:rPr/>
+        <w:rPr>
+          <w:sz w:val="24"/>
+          <w:szCs w:val="24"/>
+        </w:rPr>
       </w:pPr>
       <w:r>
         <w:rPr>
@@ -5675,327 +5668,18 @@
       <w:pPr>
         <w:spacing w:line="360" w:lineRule="auto"/>
         <w:jc w:val="both"/>
-        <w:rPr/>
-      </w:pPr>
-      <w:r>
-        <w:rPr>
-          <w:rtl w:val="0"/>
-        </w:rPr>
-      </w:r>
-    </w:p>
-    <w:p>
-      <w:pPr>
-        <w:spacing w:line="360" w:lineRule="auto"/>
-        <w:jc w:val="both"/>
-        <w:rPr/>
-      </w:pPr>
-      <w:r>
-        <w:rPr>
-          <w:rtl w:val="0"/>
-        </w:rPr>
-      </w:r>
-    </w:p>
-    <w:p>
-      <w:pPr>
-        <w:spacing w:line="360" w:lineRule="auto"/>
-        <w:jc w:val="both"/>
-        <w:rPr/>
-      </w:pPr>
-      <w:r>
-        <w:rPr>
-          <w:rtl w:val="0"/>
-        </w:rPr>
-      </w:r>
-    </w:p>
-    <w:p>
-      <w:pPr>
-        <w:spacing w:line="360" w:lineRule="auto"/>
-        <w:jc w:val="both"/>
-        <w:rPr/>
-      </w:pPr>
-      <w:r>
-        <w:rPr>
-          <w:rtl w:val="0"/>
-        </w:rPr>
-      </w:r>
-    </w:p>
-    <w:p>
-      <w:pPr>
-        <w:spacing w:line="360" w:lineRule="auto"/>
-        <w:jc w:val="both"/>
-        <w:rPr/>
-      </w:pPr>
-      <w:r>
-        <w:rPr>
-          <w:rtl w:val="0"/>
-        </w:rPr>
-      </w:r>
-    </w:p>
-    <w:p>
-      <w:pPr>
-        <w:spacing w:line="360" w:lineRule="auto"/>
-        <w:jc w:val="both"/>
-        <w:rPr/>
-      </w:pPr>
-      <w:r>
-        <w:rPr>
-          <w:rtl w:val="0"/>
-        </w:rPr>
-      </w:r>
-    </w:p>
-    <w:p>
-      <w:pPr>
-        <w:spacing w:line="360" w:lineRule="auto"/>
-        <w:jc w:val="both"/>
-        <w:rPr/>
-      </w:pPr>
-      <w:r>
-        <w:rPr>
-          <w:rtl w:val="0"/>
-        </w:rPr>
-      </w:r>
-    </w:p>
-    <w:p>
-      <w:pPr>
-        <w:spacing w:line="360" w:lineRule="auto"/>
-        <w:jc w:val="both"/>
-        <w:rPr/>
-      </w:pPr>
-      <w:r>
-        <w:rPr>
-          <w:rtl w:val="0"/>
-        </w:rPr>
-      </w:r>
-    </w:p>
-    <w:p>
-      <w:pPr>
-        <w:spacing w:line="360" w:lineRule="auto"/>
-        <w:jc w:val="both"/>
-        <w:rPr/>
-      </w:pPr>
-      <w:r>
-        <w:rPr>
-          <w:rtl w:val="0"/>
-        </w:rPr>
-      </w:r>
-    </w:p>
-    <w:p>
-      <w:pPr>
-        <w:spacing w:line="360" w:lineRule="auto"/>
-        <w:jc w:val="both"/>
-        <w:rPr/>
-      </w:pPr>
-      <w:r>
-        <w:rPr>
-          <w:rtl w:val="0"/>
-        </w:rPr>
-      </w:r>
-    </w:p>
-    <w:p>
-      <w:pPr>
-        <w:spacing w:line="360" w:lineRule="auto"/>
-        <w:jc w:val="both"/>
-        <w:rPr/>
-      </w:pPr>
-      <w:r>
-        <w:rPr>
-          <w:rtl w:val="0"/>
-        </w:rPr>
-      </w:r>
-    </w:p>
-    <w:p>
-      <w:pPr>
-        <w:spacing w:line="360" w:lineRule="auto"/>
-        <w:jc w:val="both"/>
-        <w:rPr/>
-      </w:pPr>
-      <w:r>
-        <w:rPr>
-          <w:rtl w:val="0"/>
-        </w:rPr>
-      </w:r>
-    </w:p>
-    <w:p>
-      <w:pPr>
-        <w:spacing w:line="360" w:lineRule="auto"/>
-        <w:jc w:val="both"/>
-        <w:rPr/>
-      </w:pPr>
-      <w:r>
-        <w:rPr>
-          <w:rtl w:val="0"/>
-        </w:rPr>
-      </w:r>
-    </w:p>
-    <w:p>
-      <w:pPr>
-        <w:spacing w:line="360" w:lineRule="auto"/>
-        <w:jc w:val="both"/>
-        <w:rPr/>
-      </w:pPr>
-      <w:r>
-        <w:rPr>
-          <w:rtl w:val="0"/>
-        </w:rPr>
-      </w:r>
-    </w:p>
-    <w:p>
-      <w:pPr>
-        <w:spacing w:line="360" w:lineRule="auto"/>
-        <w:jc w:val="both"/>
-        <w:rPr/>
-      </w:pPr>
-      <w:r>
-        <w:rPr>
-          <w:rtl w:val="0"/>
-        </w:rPr>
-      </w:r>
-    </w:p>
-    <w:p>
-      <w:pPr>
-        <w:spacing w:line="360" w:lineRule="auto"/>
-        <w:jc w:val="both"/>
-        <w:rPr/>
-      </w:pPr>
-      <w:r>
-        <w:rPr>
-          <w:rtl w:val="0"/>
-        </w:rPr>
-      </w:r>
-    </w:p>
-    <w:p>
-      <w:pPr>
-        <w:spacing w:line="360" w:lineRule="auto"/>
-        <w:jc w:val="both"/>
-        <w:rPr/>
-      </w:pPr>
-      <w:r>
-        <w:rPr>
-          <w:rtl w:val="0"/>
-        </w:rPr>
-      </w:r>
-    </w:p>
-    <w:p>
-      <w:pPr>
-        <w:spacing w:line="360" w:lineRule="auto"/>
-        <w:jc w:val="both"/>
-        <w:rPr/>
-      </w:pPr>
-      <w:r>
-        <w:rPr>
-          <w:rtl w:val="0"/>
-        </w:rPr>
-      </w:r>
-    </w:p>
-    <w:p>
-      <w:pPr>
-        <w:spacing w:line="360" w:lineRule="auto"/>
-        <w:jc w:val="both"/>
-        <w:rPr/>
-      </w:pPr>
-      <w:r>
-        <w:rPr>
-          <w:rtl w:val="0"/>
-        </w:rPr>
-      </w:r>
-    </w:p>
-    <w:p>
-      <w:pPr>
-        <w:spacing w:line="360" w:lineRule="auto"/>
-        <w:jc w:val="both"/>
-        <w:rPr/>
-      </w:pPr>
-      <w:r>
-        <w:rPr>
-          <w:rtl w:val="0"/>
-        </w:rPr>
-      </w:r>
-    </w:p>
-    <w:p>
-      <w:pPr>
-        <w:spacing w:line="360" w:lineRule="auto"/>
-        <w:jc w:val="both"/>
-        <w:rPr/>
-      </w:pPr>
-      <w:r>
-        <w:rPr>
-          <w:rtl w:val="0"/>
-        </w:rPr>
-      </w:r>
-    </w:p>
-    <w:p>
-      <w:pPr>
-        <w:spacing w:line="360" w:lineRule="auto"/>
-        <w:jc w:val="both"/>
-        <w:rPr/>
-      </w:pPr>
-      <w:r>
-        <w:rPr>
-          <w:rtl w:val="0"/>
-        </w:rPr>
-      </w:r>
-    </w:p>
-    <w:p>
-      <w:pPr>
-        <w:spacing w:line="360" w:lineRule="auto"/>
-        <w:jc w:val="both"/>
-        <w:rPr/>
-      </w:pPr>
-      <w:r>
-        <w:rPr>
-          <w:rtl w:val="0"/>
-        </w:rPr>
-      </w:r>
-    </w:p>
-    <w:p>
-      <w:pPr>
-        <w:spacing w:line="360" w:lineRule="auto"/>
-        <w:jc w:val="both"/>
-        <w:rPr/>
-      </w:pPr>
-      <w:r>
-        <w:rPr>
-          <w:rtl w:val="0"/>
-        </w:rPr>
-      </w:r>
-    </w:p>
-    <w:p>
-      <w:pPr>
-        <w:spacing w:line="360" w:lineRule="auto"/>
-        <w:jc w:val="both"/>
-        <w:rPr/>
-      </w:pPr>
-      <w:r>
-        <w:rPr>
-          <w:rtl w:val="0"/>
-        </w:rPr>
-      </w:r>
-    </w:p>
-    <w:p>
-      <w:pPr>
-        <w:spacing w:line="360" w:lineRule="auto"/>
-        <w:jc w:val="both"/>
-        <w:rPr/>
-      </w:pPr>
-      <w:r>
-        <w:rPr>
-          <w:rtl w:val="0"/>
-        </w:rPr>
-      </w:r>
-    </w:p>
-    <w:p>
-      <w:pPr>
-        <w:spacing w:line="360" w:lineRule="auto"/>
-        <w:jc w:val="both"/>
-        <w:rPr>
-          <w:sz w:val="24"/>
-          <w:szCs w:val="24"/>
-        </w:rPr>
-      </w:pPr>
-      <w:r>
-        <w:rPr>
-          <w:rtl w:val="0"/>
-        </w:rPr>
+        <w:rPr>
+          <w:sz w:val="24"/>
+          <w:szCs w:val="24"/>
+        </w:rPr>
+      </w:pPr>
+      <w:r>
+        <w:rPr>
+          <w:sz w:val="24"/>
+          <w:szCs w:val="24"/>
+          <w:rtl w:val="0"/>
+        </w:rPr>
+        <w:t xml:space="preserve">Jhosef</w:t>
       </w:r>
     </w:p>
     <w:tbl>
@@ -6177,7 +5861,7 @@
                 <w:szCs w:val="27"/>
                 <w:rtl w:val="0"/>
               </w:rPr>
-              <w:t xml:space="preserve">Usuário </w:t>
+              <w:t xml:space="preserve">Usuário, Sistema</w:t>
             </w:r>
             <w:r>
               <w:rPr>
@@ -6413,17 +6097,52 @@
           </w:tcPr>
           <w:p>
             <w:pPr>
-              <w:widowControl w:val="0"/>
-              <w:spacing w:line="240" w:lineRule="auto"/>
-              <w:rPr>
-                <w:sz w:val="24"/>
-                <w:szCs w:val="24"/>
-              </w:rPr>
-            </w:pPr>
-            <w:r>
-              <w:rPr>
-                <w:rtl w:val="0"/>
-              </w:rPr>
+              <w:rPr>
+                <w:sz w:val="24"/>
+                <w:szCs w:val="24"/>
+              </w:rPr>
+            </w:pPr>
+            <w:r>
+              <w:rPr>
+                <w:sz w:val="24"/>
+                <w:szCs w:val="24"/>
+                <w:rtl w:val="0"/>
+              </w:rPr>
+              <w:t xml:space="preserve">A despensa do usuário é atualizada com sucesso.</w:t>
+            </w:r>
+          </w:p>
+          <w:p>
+            <w:pPr>
+              <w:rPr>
+                <w:sz w:val="24"/>
+                <w:szCs w:val="24"/>
+              </w:rPr>
+            </w:pPr>
+            <w:r>
+              <w:rPr>
+                <w:sz w:val="24"/>
+                <w:szCs w:val="24"/>
+                <w:rtl w:val="0"/>
+              </w:rPr>
+              <w:t xml:space="preserve">* Os dados sensíveis (CPF, e-mail) permanecem </w:t>
+            </w:r>
+            <w:r>
+              <w:rPr>
+                <w:b w:val="1"/>
+                <w:bCs w:val="1"/>
+                <w:sz w:val="24"/>
+                <w:szCs w:val="24"/>
+                <w:rtl w:val="0"/>
+              </w:rPr>
+              <w:t xml:space="preserve">criptografados com AES-256</w:t>
+            </w:r>
+            <w:r>
+              <w:rPr>
+                <w:sz w:val="24"/>
+                <w:szCs w:val="24"/>
+                <w:rtl w:val="0"/>
+              </w:rPr>
+              <w:t xml:space="preserve"> em conformidade com a LGPD</w:t>
             </w:r>
           </w:p>
         </w:tc>
@@ -6480,119 +6199,276 @@
           </w:tcPr>
           <w:p>
             <w:pPr>
-              <w:widowControl w:val="0"/>
-              <w:spacing w:line="240" w:lineRule="auto"/>
-              <w:rPr>
-                <w:sz w:val="24"/>
-                <w:szCs w:val="24"/>
-              </w:rPr>
-            </w:pPr>
-            <w:r>
-              <w:rPr>
-                <w:sz w:val="24"/>
-                <w:szCs w:val="24"/>
-                <w:rtl w:val="0"/>
-              </w:rPr>
-              <w:t xml:space="preserve">1. O cliente informa o CEP de destino ou seleciona um endereço cadastrado</w:t>
-            </w:r>
-          </w:p>
-          <w:p>
-            <w:pPr>
-              <w:widowControl w:val="0"/>
-              <w:spacing w:line="240" w:lineRule="auto"/>
-              <w:rPr>
-                <w:sz w:val="24"/>
-                <w:szCs w:val="24"/>
-              </w:rPr>
-            </w:pPr>
-            <w:r>
-              <w:rPr>
-                <w:rtl w:val="0"/>
-              </w:rPr>
-            </w:r>
-          </w:p>
-          <w:p>
-            <w:pPr>
-              <w:widowControl w:val="0"/>
-              <w:spacing w:line="240" w:lineRule="auto"/>
-              <w:rPr>
-                <w:sz w:val="24"/>
-                <w:szCs w:val="24"/>
-              </w:rPr>
-            </w:pPr>
-            <w:r>
-              <w:rPr>
-                <w:sz w:val="24"/>
-                <w:szCs w:val="24"/>
-                <w:rtl w:val="0"/>
-              </w:rPr>
-              <w:t xml:space="preserve">2. O sistema consulta as tabelas de CEP e geolocalização via API sob protocolo TLS</w:t>
-            </w:r>
-          </w:p>
-          <w:p>
-            <w:pPr>
-              <w:widowControl w:val="0"/>
-              <w:spacing w:line="240" w:lineRule="auto"/>
-              <w:rPr>
-                <w:sz w:val="24"/>
-                <w:szCs w:val="24"/>
-              </w:rPr>
-            </w:pPr>
-            <w:r>
-              <w:rPr>
-                <w:rtl w:val="0"/>
-              </w:rPr>
-            </w:r>
-          </w:p>
-          <w:p>
-            <w:pPr>
-              <w:widowControl w:val="0"/>
-              <w:spacing w:line="240" w:lineRule="auto"/>
-              <w:rPr>
-                <w:sz w:val="24"/>
-                <w:szCs w:val="24"/>
-              </w:rPr>
-            </w:pPr>
-            <w:r>
-              <w:rPr>
-                <w:sz w:val="24"/>
-                <w:szCs w:val="24"/>
-                <w:rtl w:val="0"/>
-              </w:rPr>
-              <w:t xml:space="preserve">3. O sistema verifica a elegibilidade para gratuidade regional ou do programa de fidelidade.</w:t>
-            </w:r>
-          </w:p>
-          <w:p>
-            <w:pPr>
-              <w:widowControl w:val="0"/>
-              <w:spacing w:line="240" w:lineRule="auto"/>
-              <w:rPr>
-                <w:sz w:val="24"/>
-                <w:szCs w:val="24"/>
-              </w:rPr>
-            </w:pPr>
-            <w:r>
-              <w:rPr>
-                <w:rtl w:val="0"/>
-              </w:rPr>
-            </w:r>
-          </w:p>
-          <w:p>
-            <w:pPr>
-              <w:widowControl w:val="0"/>
-              <w:spacing w:line="240" w:lineRule="auto"/>
-              <w:rPr>
-                <w:sz w:val="24"/>
-                <w:szCs w:val="24"/>
-              </w:rPr>
-            </w:pPr>
-            <w:r>
-              <w:rPr>
-                <w:sz w:val="24"/>
-                <w:szCs w:val="24"/>
-                <w:rtl w:val="0"/>
-              </w:rPr>
-              <w:t xml:space="preserve">4. O sistema calcula o valor final do frete em até 1,5 segundos e o exibe no resumo da compra </w:t>
+              <w:rPr>
+                <w:sz w:val="24"/>
+                <w:szCs w:val="24"/>
+              </w:rPr>
+            </w:pPr>
+            <w:r>
+              <w:rPr>
+                <w:b w:val="1"/>
+                <w:bCs w:val="1"/>
+                <w:sz w:val="24"/>
+                <w:szCs w:val="24"/>
+                <w:rtl w:val="0"/>
+              </w:rPr>
+              <w:t xml:space="preserve">1.</w:t>
+            </w:r>
+            <w:r>
+              <w:rPr>
+                <w:sz w:val="24"/>
+                <w:szCs w:val="24"/>
+                <w:rtl w:val="0"/>
+              </w:rPr>
+              <w:t xml:space="preserve"> O usuário acessa a tela "Minha Despensa".</w:t>
+            </w:r>
+          </w:p>
+          <w:p>
+            <w:pPr>
+              <w:rPr>
+                <w:sz w:val="24"/>
+                <w:szCs w:val="24"/>
+              </w:rPr>
+            </w:pPr>
+            <w:r>
+              <w:rPr>
+                <w:b w:val="1"/>
+                <w:bCs w:val="1"/>
+                <w:sz w:val="24"/>
+                <w:szCs w:val="24"/>
+                <w:rtl w:val="0"/>
+              </w:rPr>
+              <w:t xml:space="preserve">2.</w:t>
+            </w:r>
+            <w:r>
+              <w:rPr>
+                <w:sz w:val="24"/>
+                <w:szCs w:val="24"/>
+                <w:rtl w:val="0"/>
+              </w:rPr>
+              <w:t xml:space="preserve"> O usuário digita as iniciais de um ingrediente no campo de busca.</w:t>
+            </w:r>
+          </w:p>
+          <w:p>
+            <w:pPr>
+              <w:rPr>
+                <w:sz w:val="24"/>
+                <w:szCs w:val="24"/>
+              </w:rPr>
+            </w:pPr>
+            <w:r>
+              <w:rPr>
+                <w:b w:val="1"/>
+                <w:bCs w:val="1"/>
+                <w:sz w:val="24"/>
+                <w:szCs w:val="24"/>
+                <w:rtl w:val="0"/>
+              </w:rPr>
+              <w:t xml:space="preserve">3.</w:t>
+            </w:r>
+            <w:r>
+              <w:rPr>
+                <w:sz w:val="24"/>
+                <w:szCs w:val="24"/>
+                <w:rtl w:val="0"/>
+              </w:rPr>
+              <w:t xml:space="preserve"> O sistema retorna o </w:t>
+            </w:r>
+            <w:r>
+              <w:rPr>
+                <w:sz w:val="24"/>
+                <w:szCs w:val="24"/>
+                <w:rtl w:val="0"/>
+              </w:rPr>
+              <w:t xml:space="preserve">autocompletar em até 300ms</w:t>
+            </w:r>
+            <w:r>
+              <w:rPr>
+                <w:sz w:val="24"/>
+                <w:szCs w:val="24"/>
+                <w:rtl w:val="0"/>
+              </w:rPr>
+              <w:t xml:space="preserve"> </w:t>
+            </w:r>
+            <w:r>
+              <w:rPr>
+                <w:rFonts w:ascii="Courier New" w:cs="Courier New" w:eastAsia="Courier New" w:hAnsi="Courier New"/>
+                <w:sz w:val="24"/>
+                <w:szCs w:val="24"/>
+                <w:rtl w:val="0"/>
+              </w:rPr>
+              <w:t xml:space="preserve">[RFN 01.02]</w:t>
+            </w:r>
+            <w:r>
+              <w:rPr>
+                <w:sz w:val="24"/>
+                <w:szCs w:val="24"/>
+                <w:rtl w:val="0"/>
+              </w:rPr>
+              <w:t xml:space="preserve">.</w:t>
+            </w:r>
+          </w:p>
+          <w:p>
+            <w:pPr>
+              <w:rPr>
+                <w:sz w:val="24"/>
+                <w:szCs w:val="24"/>
+              </w:rPr>
+            </w:pPr>
+            <w:r>
+              <w:rPr>
+                <w:b w:val="1"/>
+                <w:bCs w:val="1"/>
+                <w:sz w:val="24"/>
+                <w:szCs w:val="24"/>
+                <w:rtl w:val="0"/>
+              </w:rPr>
+              <w:t xml:space="preserve">4.</w:t>
+            </w:r>
+            <w:r>
+              <w:rPr>
+                <w:sz w:val="24"/>
+                <w:szCs w:val="24"/>
+                <w:rtl w:val="0"/>
+              </w:rPr>
+              <w:t xml:space="preserve"> O usuário seleciona o ingrediente e clica em "Adicionar".</w:t>
+            </w:r>
+          </w:p>
+          <w:p>
+            <w:pPr>
+              <w:rPr>
+                <w:sz w:val="24"/>
+                <w:szCs w:val="24"/>
+              </w:rPr>
+            </w:pPr>
+            <w:r>
+              <w:rPr>
+                <w:b w:val="1"/>
+                <w:bCs w:val="1"/>
+                <w:sz w:val="24"/>
+                <w:szCs w:val="24"/>
+                <w:rtl w:val="0"/>
+              </w:rPr>
+              <w:t xml:space="preserve">5.</w:t>
+            </w:r>
+            <w:r>
+              <w:rPr>
+                <w:sz w:val="24"/>
+                <w:szCs w:val="24"/>
+                <w:rtl w:val="0"/>
+              </w:rPr>
+              <w:t xml:space="preserve"> O sistema atualiza a lista da despensa virtual.</w:t>
+            </w:r>
+          </w:p>
+          <w:p>
+            <w:pPr>
+              <w:rPr>
+                <w:sz w:val="24"/>
+                <w:szCs w:val="24"/>
+              </w:rPr>
+            </w:pPr>
+            <w:r>
+              <w:rPr>
+                <w:b w:val="1"/>
+                <w:bCs w:val="1"/>
+                <w:sz w:val="24"/>
+                <w:szCs w:val="24"/>
+                <w:rtl w:val="0"/>
+              </w:rPr>
+              <w:t xml:space="preserve">6.</w:t>
+            </w:r>
+            <w:r>
+              <w:rPr>
+                <w:sz w:val="24"/>
+                <w:szCs w:val="24"/>
+                <w:rtl w:val="0"/>
+              </w:rPr>
+              <w:t xml:space="preserve"> O usuário clica em "Buscar Receitas".</w:t>
+            </w:r>
+          </w:p>
+          <w:p>
+            <w:pPr>
+              <w:rPr>
+                <w:sz w:val="24"/>
+                <w:szCs w:val="24"/>
+              </w:rPr>
+            </w:pPr>
+            <w:r>
+              <w:rPr>
+                <w:b w:val="1"/>
+                <w:bCs w:val="1"/>
+                <w:sz w:val="24"/>
+                <w:szCs w:val="24"/>
+                <w:rtl w:val="0"/>
+              </w:rPr>
+              <w:t xml:space="preserve">7.</w:t>
+            </w:r>
+            <w:r>
+              <w:rPr>
+                <w:sz w:val="24"/>
+                <w:szCs w:val="24"/>
+                <w:rtl w:val="0"/>
+              </w:rPr>
+              <w:t xml:space="preserve"> O sistema cruza os dados e </w:t>
+            </w:r>
+            <w:r>
+              <w:rPr>
+                <w:sz w:val="24"/>
+                <w:szCs w:val="24"/>
+                <w:rtl w:val="0"/>
+              </w:rPr>
+              <w:t xml:space="preserve">processa a matriz em até 1,5 segundos</w:t>
+            </w:r>
+            <w:r>
+              <w:rPr>
+                <w:sz w:val="24"/>
+                <w:szCs w:val="24"/>
+                <w:rtl w:val="0"/>
+              </w:rPr>
+              <w:t xml:space="preserve"> </w:t>
+            </w:r>
+            <w:r>
+              <w:rPr>
+                <w:rFonts w:ascii="Courier New" w:cs="Courier New" w:eastAsia="Courier New" w:hAnsi="Courier New"/>
+                <w:sz w:val="24"/>
+                <w:szCs w:val="24"/>
+                <w:rtl w:val="0"/>
+              </w:rPr>
+              <w:t xml:space="preserve">[RFN 02.01]</w:t>
+            </w:r>
+            <w:r>
+              <w:rPr>
+                <w:sz w:val="24"/>
+                <w:szCs w:val="24"/>
+                <w:rtl w:val="0"/>
+              </w:rPr>
+              <w:t xml:space="preserve">.</w:t>
+            </w:r>
+          </w:p>
+          <w:p>
+            <w:pPr>
+              <w:rPr>
+                <w:sz w:val="24"/>
+                <w:szCs w:val="24"/>
+              </w:rPr>
+            </w:pPr>
+            <w:r>
+              <w:rPr>
+                <w:b w:val="1"/>
+                <w:bCs w:val="1"/>
+                <w:sz w:val="24"/>
+                <w:szCs w:val="24"/>
+                <w:rtl w:val="0"/>
+              </w:rPr>
+              <w:t xml:space="preserve">8.</w:t>
+            </w:r>
+            <w:r>
+              <w:rPr>
+                <w:sz w:val="24"/>
+                <w:szCs w:val="24"/>
+                <w:rtl w:val="0"/>
+              </w:rPr>
+              <w:t xml:space="preserve"> O sistema exibe as receitas viáveis na tela.</w:t>
             </w:r>
           </w:p>
         </w:tc>
@@ -6652,129 +6528,164 @@
               <w:widowControl w:val="0"/>
               <w:spacing w:line="240" w:lineRule="auto"/>
               <w:rPr>
-                <w:b w:val="1"/>
-                <w:bCs w:val="1"/>
-                <w:sz w:val="24"/>
-                <w:szCs w:val="24"/>
-              </w:rPr>
-            </w:pPr>
-            <w:r>
-              <w:rPr>
-                <w:b w:val="1"/>
-                <w:bCs w:val="1"/>
-                <w:sz w:val="24"/>
-                <w:szCs w:val="24"/>
-                <w:rtl w:val="0"/>
-              </w:rPr>
-              <w:t xml:space="preserve">FA01 - Aplicação de Frete Grátis:</w:t>
-            </w:r>
-          </w:p>
-          <w:p>
-            <w:pPr>
-              <w:widowControl w:val="0"/>
-              <w:spacing w:line="240" w:lineRule="auto"/>
-              <w:rPr>
-                <w:sz w:val="24"/>
-                <w:szCs w:val="24"/>
-              </w:rPr>
-            </w:pPr>
-            <w:r>
-              <w:rPr>
-                <w:rtl w:val="0"/>
-              </w:rPr>
-            </w:r>
-          </w:p>
-          <w:p>
-            <w:pPr>
-              <w:widowControl w:val="0"/>
-              <w:numPr>
-                <w:ilvl w:val="0"/>
-                <w:numId w:val="1"/>
-              </w:numPr>
-              <w:spacing w:line="240" w:lineRule="auto"/>
-              <w:ind w:left="720" w:hanging="360"/>
-              <w:rPr>
-                <w:sz w:val="24"/>
-                <w:szCs w:val="24"/>
-              </w:rPr>
-            </w:pPr>
-            <w:r>
-              <w:rPr>
-                <w:b w:val="1"/>
-                <w:bCs w:val="1"/>
-                <w:sz w:val="24"/>
-                <w:szCs w:val="24"/>
-                <w:rtl w:val="0"/>
-              </w:rPr>
-              <w:t xml:space="preserve">3a.</w:t>
-            </w:r>
-            <w:r>
-              <w:rPr>
-                <w:sz w:val="24"/>
-                <w:szCs w:val="24"/>
-                <w:rtl w:val="0"/>
-              </w:rPr>
-              <w:t xml:space="preserve"> O sistema identifica que o CEP pertence à mesma região metropolitana do CD ou que o cliente é membro ativo do programa de fidelidade. </w:t>
-            </w:r>
-          </w:p>
-          <w:p>
-            <w:pPr>
-              <w:widowControl w:val="0"/>
-              <w:spacing w:line="240" w:lineRule="auto"/>
-              <w:ind w:left="720" w:firstLine="0"/>
-              <w:rPr>
-                <w:sz w:val="24"/>
-                <w:szCs w:val="24"/>
-              </w:rPr>
-            </w:pPr>
-            <w:r>
-              <w:rPr>
-                <w:rtl w:val="0"/>
-              </w:rPr>
-            </w:r>
-          </w:p>
-          <w:p>
-            <w:pPr>
-              <w:widowControl w:val="0"/>
-              <w:numPr>
-                <w:ilvl w:val="0"/>
-                <w:numId w:val="1"/>
-              </w:numPr>
-              <w:spacing w:line="240" w:lineRule="auto"/>
-              <w:ind w:left="720" w:hanging="360"/>
-              <w:rPr>
-                <w:sz w:val="24"/>
-                <w:szCs w:val="24"/>
-              </w:rPr>
-            </w:pPr>
-            <w:r>
-              <w:rPr>
-                <w:b w:val="1"/>
-                <w:bCs w:val="1"/>
-                <w:sz w:val="24"/>
-                <w:szCs w:val="24"/>
-                <w:rtl w:val="0"/>
-              </w:rPr>
-              <w:t xml:space="preserve">3b.</w:t>
-            </w:r>
-            <w:r>
-              <w:rPr>
-                <w:sz w:val="24"/>
-                <w:szCs w:val="24"/>
-                <w:rtl w:val="0"/>
-              </w:rPr>
-              <w:t xml:space="preserve"> O sistema aplica isenção total de frete (R$ 0,00) ao carrinho. </w:t>
-            </w:r>
-          </w:p>
-          <w:p>
-            <w:pPr>
-              <w:widowControl w:val="0"/>
-              <w:spacing w:line="240" w:lineRule="auto"/>
-              <w:rPr>
-                <w:sz w:val="24"/>
-                <w:szCs w:val="24"/>
-              </w:rPr>
-            </w:pPr>
+                <w:sz w:val="24"/>
+                <w:szCs w:val="24"/>
+              </w:rPr>
+            </w:pPr>
+            <w:r>
+              <w:rPr>
+                <w:b w:val="1"/>
+                <w:bCs w:val="1"/>
+                <w:sz w:val="24"/>
+                <w:szCs w:val="24"/>
+                <w:rtl w:val="0"/>
+              </w:rPr>
+              <w:t xml:space="preserve">A: 1.</w:t>
+            </w:r>
+            <w:r>
+              <w:rPr>
+                <w:sz w:val="24"/>
+                <w:szCs w:val="24"/>
+                <w:rtl w:val="0"/>
+              </w:rPr>
+              <w:t xml:space="preserve"> No passo 7, o sistema detecta receitas com ingredientes ausentes.</w:t>
+            </w:r>
+          </w:p>
+          <w:p>
+            <w:pPr>
+              <w:rPr>
+                <w:sz w:val="24"/>
+                <w:szCs w:val="24"/>
+              </w:rPr>
+            </w:pPr>
+            <w:r>
+              <w:rPr>
+                <w:b w:val="1"/>
+                <w:bCs w:val="1"/>
+                <w:sz w:val="24"/>
+                <w:szCs w:val="24"/>
+                <w:rtl w:val="0"/>
+              </w:rPr>
+              <w:t xml:space="preserve">2.</w:t>
+            </w:r>
+            <w:r>
+              <w:rPr>
+                <w:sz w:val="24"/>
+                <w:szCs w:val="24"/>
+                <w:rtl w:val="0"/>
+              </w:rPr>
+              <w:t xml:space="preserve"> O sistema busca alternativas equivalentes no banco de dados.</w:t>
+            </w:r>
+          </w:p>
+          <w:p>
+            <w:pPr>
+              <w:rPr>
+                <w:sz w:val="24"/>
+                <w:szCs w:val="24"/>
+              </w:rPr>
+            </w:pPr>
+            <w:r>
+              <w:rPr>
+                <w:b w:val="1"/>
+                <w:bCs w:val="1"/>
+                <w:sz w:val="24"/>
+                <w:szCs w:val="24"/>
+                <w:rtl w:val="0"/>
+              </w:rPr>
+              <w:t xml:space="preserve">3.</w:t>
+            </w:r>
+            <w:r>
+              <w:rPr>
+                <w:sz w:val="24"/>
+                <w:szCs w:val="24"/>
+                <w:rtl w:val="0"/>
+              </w:rPr>
+              <w:t xml:space="preserve"> No passo 8, a receita é exibida com um alerta e a sugestão de substitutos viáveis </w:t>
+            </w:r>
+            <w:r>
+              <w:rPr>
+                <w:rFonts w:ascii="Courier New" w:cs="Courier New" w:eastAsia="Courier New" w:hAnsi="Courier New"/>
+                <w:sz w:val="24"/>
+                <w:szCs w:val="24"/>
+                <w:rtl w:val="0"/>
+              </w:rPr>
+              <w:t xml:space="preserve">[RF02]</w:t>
+            </w:r>
+            <w:r>
+              <w:rPr>
+                <w:sz w:val="24"/>
+                <w:szCs w:val="24"/>
+                <w:rtl w:val="0"/>
+              </w:rPr>
+              <w:t xml:space="preserve">.</w:t>
+            </w:r>
+          </w:p>
+          <w:p>
+            <w:pPr>
+              <w:rPr>
+                <w:sz w:val="24"/>
+                <w:szCs w:val="24"/>
+              </w:rPr>
+            </w:pPr>
+            <w:r>
+              <w:rPr>
+                <w:rtl w:val="0"/>
+              </w:rPr>
+            </w:r>
+          </w:p>
+          <w:p>
+            <w:pPr>
+              <w:rPr>
+                <w:sz w:val="24"/>
+                <w:szCs w:val="24"/>
+              </w:rPr>
+            </w:pPr>
+            <w:r>
+              <w:rPr>
+                <w:b w:val="1"/>
+                <w:bCs w:val="1"/>
+                <w:sz w:val="24"/>
+                <w:szCs w:val="24"/>
+                <w:rtl w:val="0"/>
+              </w:rPr>
+              <w:t xml:space="preserve">B  1.</w:t>
+            </w:r>
+            <w:r>
+              <w:rPr>
+                <w:sz w:val="24"/>
+                <w:szCs w:val="24"/>
+                <w:rtl w:val="0"/>
+              </w:rPr>
+              <w:t xml:space="preserve"> Na tela da despensa, o usuário clica em "Remover" ao lado de um ingrediente.</w:t>
+            </w:r>
+          </w:p>
+          <w:p>
+            <w:pPr>
+              <w:rPr>
+                <w:b w:val="1"/>
+                <w:bCs w:val="1"/>
+                <w:sz w:val="24"/>
+                <w:szCs w:val="24"/>
+              </w:rPr>
+            </w:pPr>
+            <w:r>
+              <w:rPr>
+                <w:b w:val="1"/>
+                <w:bCs w:val="1"/>
+                <w:sz w:val="24"/>
+                <w:szCs w:val="24"/>
+                <w:rtl w:val="0"/>
+              </w:rPr>
+              <w:t xml:space="preserve">2.</w:t>
+            </w:r>
+            <w:r>
+              <w:rPr>
+                <w:sz w:val="24"/>
+                <w:szCs w:val="24"/>
+                <w:rtl w:val="0"/>
+              </w:rPr>
+              <w:t xml:space="preserve"> O sistema exclui o item e atualiza a lista instantaneamente.</w:t>
+            </w:r>
             <w:r>
               <w:rPr>
                 <w:rtl w:val="0"/>
@@ -6838,118 +6749,24 @@
               <w:widowControl w:val="0"/>
               <w:spacing w:line="240" w:lineRule="auto"/>
               <w:rPr>
-                <w:b w:val="1"/>
-                <w:bCs w:val="1"/>
-                <w:sz w:val="24"/>
-                <w:szCs w:val="24"/>
-              </w:rPr>
-            </w:pPr>
-            <w:r>
-              <w:rPr>
-                <w:b w:val="1"/>
-                <w:bCs w:val="1"/>
-                <w:sz w:val="24"/>
-                <w:szCs w:val="24"/>
-                <w:rtl w:val="0"/>
-              </w:rPr>
-              <w:t xml:space="preserve">FE01 - Indisponibilidade na API da Transportadora:</w:t>
-            </w:r>
-          </w:p>
-          <w:p>
-            <w:pPr>
-              <w:widowControl w:val="0"/>
-              <w:spacing w:line="240" w:lineRule="auto"/>
-              <w:rPr>
-                <w:sz w:val="24"/>
-                <w:szCs w:val="24"/>
-              </w:rPr>
-            </w:pPr>
-            <w:r>
-              <w:rPr>
-                <w:rtl w:val="0"/>
-              </w:rPr>
-            </w:r>
-          </w:p>
-          <w:p>
-            <w:pPr>
-              <w:widowControl w:val="0"/>
-              <w:numPr>
-                <w:ilvl w:val="0"/>
-                <w:numId w:val="2"/>
-              </w:numPr>
-              <w:spacing w:line="240" w:lineRule="auto"/>
-              <w:ind w:left="720" w:hanging="360"/>
-              <w:rPr>
-                <w:sz w:val="24"/>
-                <w:szCs w:val="24"/>
-              </w:rPr>
-            </w:pPr>
-            <w:r>
-              <w:rPr>
-                <w:b w:val="1"/>
-                <w:bCs w:val="1"/>
-                <w:sz w:val="24"/>
-                <w:szCs w:val="24"/>
-                <w:rtl w:val="0"/>
-              </w:rPr>
-              <w:t xml:space="preserve">2a.</w:t>
-            </w:r>
-            <w:r>
-              <w:rPr>
-                <w:sz w:val="24"/>
-                <w:szCs w:val="24"/>
-                <w:rtl w:val="0"/>
-              </w:rPr>
-              <w:t xml:space="preserve"> A API de cálculo da transportadora não responde no tempo limite. </w:t>
-            </w:r>
-          </w:p>
-          <w:p>
-            <w:pPr>
-              <w:widowControl w:val="0"/>
-              <w:spacing w:line="240" w:lineRule="auto"/>
-              <w:ind w:left="720" w:firstLine="0"/>
-              <w:rPr>
-                <w:sz w:val="24"/>
-                <w:szCs w:val="24"/>
-              </w:rPr>
-            </w:pPr>
-            <w:r>
-              <w:rPr>
-                <w:rtl w:val="0"/>
-              </w:rPr>
-            </w:r>
-          </w:p>
-          <w:p>
-            <w:pPr>
-              <w:widowControl w:val="0"/>
-              <w:numPr>
-                <w:ilvl w:val="0"/>
-                <w:numId w:val="2"/>
-              </w:numPr>
-              <w:spacing w:line="240" w:lineRule="auto"/>
-              <w:ind w:left="720" w:hanging="360"/>
-              <w:rPr>
-                <w:sz w:val="24"/>
-                <w:szCs w:val="24"/>
-              </w:rPr>
-            </w:pPr>
-            <w:r>
-              <w:rPr>
-                <w:b w:val="1"/>
-                <w:bCs w:val="1"/>
-                <w:sz w:val="24"/>
-                <w:szCs w:val="24"/>
-                <w:rtl w:val="0"/>
-              </w:rPr>
-              <w:t xml:space="preserve">2b.</w:t>
-            </w:r>
-            <w:r>
-              <w:rPr>
-                <w:sz w:val="24"/>
-                <w:szCs w:val="24"/>
-                <w:rtl w:val="0"/>
-              </w:rPr>
-              <w:t xml:space="preserve"> O sistema utiliza a tabela de contingência offline de frete estimado e exibe aviso ao usuário. (Pode ter alteração no valor - Deve ser consultado posteriormente)</w:t>
+                <w:sz w:val="24"/>
+                <w:szCs w:val="24"/>
+              </w:rPr>
+            </w:pPr>
+            <w:r>
+              <w:rPr>
+                <w:b w:val="1"/>
+                <w:bCs w:val="1"/>
+                <w:sz w:val="24"/>
+                <w:szCs w:val="24"/>
+                <w:rtl w:val="0"/>
+              </w:rPr>
+              <w:t xml:space="preserve">FE01 -</w:t>
+            </w:r>
+            <w:r>
+              <w:rPr>
+                <w:rtl w:val="0"/>
+              </w:rPr>
             </w:r>
           </w:p>
         </w:tc>
@@ -7123,6 +6940,1741 @@
         </w:rPr>
       </w:r>
     </w:p>
+    <w:p>
+      <w:pPr>
+        <w:spacing w:line="360" w:lineRule="auto"/>
+        <w:jc w:val="both"/>
+        <w:rPr/>
+      </w:pPr>
+      <w:r>
+        <w:rPr>
+          <w:rtl w:val="0"/>
+        </w:rPr>
+      </w:r>
+    </w:p>
+    <w:p>
+      <w:pPr>
+        <w:spacing w:line="360" w:lineRule="auto"/>
+        <w:jc w:val="both"/>
+        <w:rPr/>
+      </w:pPr>
+      <w:r>
+        <w:rPr>
+          <w:rtl w:val="0"/>
+        </w:rPr>
+      </w:r>
+    </w:p>
+    <w:p>
+      <w:pPr>
+        <w:spacing w:line="360" w:lineRule="auto"/>
+        <w:jc w:val="both"/>
+        <w:rPr/>
+      </w:pPr>
+      <w:r>
+        <w:rPr>
+          <w:rtl w:val="0"/>
+        </w:rPr>
+      </w:r>
+    </w:p>
+    <w:p>
+      <w:pPr>
+        <w:spacing w:line="360" w:lineRule="auto"/>
+        <w:jc w:val="both"/>
+        <w:rPr/>
+      </w:pPr>
+      <w:r>
+        <w:rPr>
+          <w:rtl w:val="0"/>
+        </w:rPr>
+      </w:r>
+    </w:p>
+    <w:p>
+      <w:pPr>
+        <w:spacing w:line="360" w:lineRule="auto"/>
+        <w:jc w:val="both"/>
+        <w:rPr/>
+      </w:pPr>
+      <w:r>
+        <w:rPr>
+          <w:rtl w:val="0"/>
+        </w:rPr>
+      </w:r>
+    </w:p>
+    <w:p>
+      <w:pPr>
+        <w:spacing w:line="360" w:lineRule="auto"/>
+        <w:jc w:val="both"/>
+        <w:rPr/>
+      </w:pPr>
+      <w:r>
+        <w:rPr>
+          <w:rtl w:val="0"/>
+        </w:rPr>
+      </w:r>
+    </w:p>
+    <w:p>
+      <w:pPr>
+        <w:spacing w:line="360" w:lineRule="auto"/>
+        <w:jc w:val="both"/>
+        <w:rPr/>
+      </w:pPr>
+      <w:r>
+        <w:rPr>
+          <w:rtl w:val="0"/>
+        </w:rPr>
+      </w:r>
+    </w:p>
+    <w:p>
+      <w:pPr>
+        <w:spacing w:line="360" w:lineRule="auto"/>
+        <w:jc w:val="both"/>
+        <w:rPr/>
+      </w:pPr>
+      <w:r>
+        <w:rPr>
+          <w:rtl w:val="0"/>
+        </w:rPr>
+      </w:r>
+    </w:p>
+    <w:p>
+      <w:pPr>
+        <w:spacing w:line="360" w:lineRule="auto"/>
+        <w:jc w:val="both"/>
+        <w:rPr/>
+      </w:pPr>
+      <w:r>
+        <w:rPr>
+          <w:rtl w:val="0"/>
+        </w:rPr>
+      </w:r>
+    </w:p>
+    <w:p>
+      <w:pPr>
+        <w:spacing w:line="360" w:lineRule="auto"/>
+        <w:jc w:val="both"/>
+        <w:rPr/>
+      </w:pPr>
+      <w:r>
+        <w:rPr>
+          <w:rtl w:val="0"/>
+        </w:rPr>
+      </w:r>
+    </w:p>
+    <w:p>
+      <w:pPr>
+        <w:spacing w:line="360" w:lineRule="auto"/>
+        <w:jc w:val="both"/>
+        <w:rPr/>
+      </w:pPr>
+      <w:r>
+        <w:rPr>
+          <w:rtl w:val="0"/>
+        </w:rPr>
+      </w:r>
+    </w:p>
+    <w:p>
+      <w:pPr>
+        <w:spacing w:line="360" w:lineRule="auto"/>
+        <w:jc w:val="both"/>
+        <w:rPr/>
+      </w:pPr>
+      <w:r>
+        <w:rPr>
+          <w:rtl w:val="0"/>
+        </w:rPr>
+      </w:r>
+    </w:p>
+    <w:p>
+      <w:pPr>
+        <w:spacing w:line="360" w:lineRule="auto"/>
+        <w:jc w:val="both"/>
+        <w:rPr/>
+      </w:pPr>
+      <w:r>
+        <w:rPr>
+          <w:rtl w:val="0"/>
+        </w:rPr>
+      </w:r>
+    </w:p>
+    <w:p>
+      <w:pPr>
+        <w:spacing w:line="360" w:lineRule="auto"/>
+        <w:jc w:val="both"/>
+        <w:rPr/>
+      </w:pPr>
+      <w:r>
+        <w:rPr>
+          <w:rtl w:val="0"/>
+        </w:rPr>
+      </w:r>
+    </w:p>
+    <w:p>
+      <w:pPr>
+        <w:spacing w:line="360" w:lineRule="auto"/>
+        <w:jc w:val="both"/>
+        <w:rPr/>
+      </w:pPr>
+      <w:r>
+        <w:rPr>
+          <w:rtl w:val="0"/>
+        </w:rPr>
+      </w:r>
+    </w:p>
+    <w:p>
+      <w:pPr>
+        <w:spacing w:after="180" w:before="360" w:line="360" w:lineRule="auto"/>
+        <w:jc w:val="both"/>
+        <w:rPr>
+          <w:sz w:val="30"/>
+          <w:szCs w:val="30"/>
+        </w:rPr>
+      </w:pPr>
+      <w:r>
+        <w:rPr>
+          <w:sz w:val="30"/>
+          <w:szCs w:val="30"/>
+          <w:rtl w:val="0"/>
+        </w:rPr>
+        <w:t xml:space="preserve">Caso de Uso Expandido: UC03 – Localizar Mercados e Compra Expressa</w:t>
+      </w:r>
+    </w:p>
+    <w:p>
+      <w:pPr>
+        <w:numPr>
+          <w:ilvl w:val="0"/>
+          <w:numId w:val="1"/>
+        </w:numPr>
+        <w:spacing w:after="0" w:afterAutospacing="0" w:before="180" w:line="360" w:lineRule="auto"/>
+        <w:ind w:left="720" w:hanging="360"/>
+      </w:pPr>
+      <w:r>
+        <w:rPr>
+          <w:b w:val="1"/>
+          <w:bCs w:val="1"/>
+          <w:sz w:val="24"/>
+          <w:szCs w:val="24"/>
+          <w:rtl w:val="0"/>
+        </w:rPr>
+        <w:t xml:space="preserve">Atores Principais:</w:t>
+      </w:r>
+      <w:r>
+        <w:rPr>
+          <w:sz w:val="24"/>
+          <w:szCs w:val="24"/>
+          <w:rtl w:val="0"/>
+        </w:rPr>
+        <w:t xml:space="preserve"> Cliente (Usuário do app).</w:t>
+      </w:r>
+    </w:p>
+    <w:p>
+      <w:pPr>
+        <w:numPr>
+          <w:ilvl w:val="0"/>
+          <w:numId w:val="1"/>
+        </w:numPr>
+        <w:spacing w:after="0" w:afterAutospacing="0" w:before="0" w:beforeAutospacing="0" w:line="360" w:lineRule="auto"/>
+        <w:ind w:left="720" w:hanging="360"/>
+      </w:pPr>
+      <w:r>
+        <w:rPr>
+          <w:b w:val="1"/>
+          <w:bCs w:val="1"/>
+          <w:sz w:val="24"/>
+          <w:szCs w:val="24"/>
+          <w:rtl w:val="0"/>
+        </w:rPr>
+        <w:t xml:space="preserve">Atores Secundários:</w:t>
+      </w:r>
+      <w:r>
+        <w:rPr>
+          <w:sz w:val="24"/>
+          <w:szCs w:val="24"/>
+          <w:rtl w:val="0"/>
+        </w:rPr>
+        <w:t xml:space="preserve"> API de Geolocalização (ex: Google Maps / CoreLocation), Sistema de Inventário dos Mercados.</w:t>
+      </w:r>
+    </w:p>
+    <w:p>
+      <w:pPr>
+        <w:numPr>
+          <w:ilvl w:val="0"/>
+          <w:numId w:val="1"/>
+        </w:numPr>
+        <w:spacing w:after="0" w:afterAutospacing="0" w:before="0" w:beforeAutospacing="0" w:line="360" w:lineRule="auto"/>
+        <w:ind w:left="720" w:hanging="360"/>
+      </w:pPr>
+      <w:r>
+        <w:rPr>
+          <w:b w:val="1"/>
+          <w:bCs w:val="1"/>
+          <w:sz w:val="24"/>
+          <w:szCs w:val="24"/>
+          <w:rtl w:val="0"/>
+        </w:rPr>
+        <w:t xml:space="preserve">Pré-condições:</w:t>
+      </w:r>
+      <w:r>
+        <w:rPr>
+          <w:sz w:val="24"/>
+          <w:szCs w:val="24"/>
+          <w:rtl w:val="0"/>
+        </w:rPr>
+        <w:t xml:space="preserve"> O Cliente deve estar autenticado no sistema e o dispositivo deve estar com o GPS ativado.</w:t>
+      </w:r>
+    </w:p>
+    <w:p>
+      <w:pPr>
+        <w:numPr>
+          <w:ilvl w:val="0"/>
+          <w:numId w:val="1"/>
+        </w:numPr>
+        <w:spacing w:after="240" w:before="0" w:beforeAutospacing="0" w:line="360" w:lineRule="auto"/>
+        <w:ind w:left="720" w:hanging="360"/>
+      </w:pPr>
+      <w:r>
+        <w:rPr>
+          <w:b w:val="1"/>
+          <w:bCs w:val="1"/>
+          <w:sz w:val="24"/>
+          <w:szCs w:val="24"/>
+          <w:rtl w:val="0"/>
+        </w:rPr>
+        <w:t xml:space="preserve">Pós-condições:</w:t>
+      </w:r>
+      <w:r>
+        <w:rPr>
+          <w:sz w:val="24"/>
+          <w:szCs w:val="24"/>
+          <w:rtl w:val="0"/>
+        </w:rPr>
+        <w:t xml:space="preserve"> Os mercados próximos são exibidos e os itens selecionados são inseridos com sucesso no carrinho de compras.</w:t>
+      </w:r>
+    </w:p>
+    <w:p>
+      <w:pPr>
+        <w:spacing w:after="180" w:before="360" w:line="360" w:lineRule="auto"/>
+        <w:jc w:val="both"/>
+        <w:rPr>
+          <w:b w:val="1"/>
+          <w:bCs w:val="1"/>
+          <w:sz w:val="24"/>
+          <w:szCs w:val="24"/>
+        </w:rPr>
+      </w:pPr>
+      <w:r>
+        <w:rPr>
+          <w:b w:val="1"/>
+          <w:bCs w:val="1"/>
+          <w:sz w:val="24"/>
+          <w:szCs w:val="24"/>
+          <w:rtl w:val="0"/>
+        </w:rPr>
+        <w:t xml:space="preserve">Fluxo Principal (Cenário de Sucesso)</w:t>
+      </w:r>
+    </w:p>
+    <w:p>
+      <w:pPr>
+        <w:numPr>
+          <w:ilvl w:val="0"/>
+          <w:numId w:val="2"/>
+        </w:numPr>
+        <w:spacing w:after="0" w:afterAutospacing="0" w:before="180" w:line="360" w:lineRule="auto"/>
+        <w:ind w:left="720" w:hanging="360"/>
+      </w:pPr>
+      <w:r>
+        <w:rPr>
+          <w:sz w:val="24"/>
+          <w:szCs w:val="24"/>
+          <w:rtl w:val="0"/>
+        </w:rPr>
+        <w:t xml:space="preserve">O Cliente acessa a tela de busca de ingredientes ou a área de compras do sistema.</w:t>
+      </w:r>
+    </w:p>
+    <w:p>
+      <w:pPr>
+        <w:numPr>
+          <w:ilvl w:val="0"/>
+          <w:numId w:val="2"/>
+        </w:numPr>
+        <w:spacing w:after="0" w:afterAutospacing="0" w:before="0" w:beforeAutospacing="0" w:line="360" w:lineRule="auto"/>
+        <w:ind w:left="720" w:hanging="360"/>
+      </w:pPr>
+      <w:r>
+        <w:rPr>
+          <w:sz w:val="24"/>
+          <w:szCs w:val="24"/>
+          <w:rtl w:val="0"/>
+        </w:rPr>
+        <w:t xml:space="preserve">O sistema solicita a geolocalização atual do dispositivo do Cliente através da API de GPS.</w:t>
+      </w:r>
+    </w:p>
+    <w:p>
+      <w:pPr>
+        <w:numPr>
+          <w:ilvl w:val="0"/>
+          <w:numId w:val="2"/>
+        </w:numPr>
+        <w:spacing w:after="0" w:afterAutospacing="0" w:before="0" w:beforeAutospacing="0" w:line="360" w:lineRule="auto"/>
+        <w:ind w:left="720" w:hanging="360"/>
+      </w:pPr>
+      <w:r>
+        <w:rPr>
+          <w:sz w:val="24"/>
+          <w:szCs w:val="24"/>
+          <w:rtl w:val="0"/>
+        </w:rPr>
+        <w:t xml:space="preserve">O sistema recebe as coordenadas com uma </w:t>
+      </w:r>
+      <w:r>
+        <w:rPr>
+          <w:b w:val="1"/>
+          <w:bCs w:val="1"/>
+          <w:sz w:val="24"/>
+          <w:szCs w:val="24"/>
+          <w:rtl w:val="0"/>
+        </w:rPr>
+        <w:t xml:space="preserve">precisão de raio inferior a 50 metros [RFN 03.01]</w:t>
+      </w:r>
+      <w:r>
+        <w:rPr>
+          <w:sz w:val="24"/>
+          <w:szCs w:val="24"/>
+          <w:rtl w:val="0"/>
+        </w:rPr>
+        <w:t xml:space="preserve">.</w:t>
+      </w:r>
+    </w:p>
+    <w:p>
+      <w:pPr>
+        <w:numPr>
+          <w:ilvl w:val="0"/>
+          <w:numId w:val="2"/>
+        </w:numPr>
+        <w:spacing w:after="0" w:afterAutospacing="0" w:before="0" w:beforeAutospacing="0" w:line="360" w:lineRule="auto"/>
+        <w:ind w:left="720" w:hanging="360"/>
+      </w:pPr>
+      <w:r>
+        <w:rPr>
+          <w:sz w:val="24"/>
+          <w:szCs w:val="24"/>
+          <w:rtl w:val="0"/>
+        </w:rPr>
+        <w:t xml:space="preserve">O sistema consulta a base de dados e identifica os supermercados parceiros credenciados que estão no raio de cobertura daquela localização.</w:t>
+      </w:r>
+    </w:p>
+    <w:p>
+      <w:pPr>
+        <w:numPr>
+          <w:ilvl w:val="0"/>
+          <w:numId w:val="2"/>
+        </w:numPr>
+        <w:spacing w:after="0" w:afterAutospacing="0" w:before="0" w:beforeAutospacing="0" w:line="360" w:lineRule="auto"/>
+        <w:ind w:left="720" w:hanging="360"/>
+      </w:pPr>
+      <w:r>
+        <w:rPr>
+          <w:sz w:val="24"/>
+          <w:szCs w:val="24"/>
+          <w:rtl w:val="0"/>
+        </w:rPr>
+        <w:t xml:space="preserve">O sistema apresenta ao Cliente a lista de mercados parceiros mais próximos e os produtos/ingredientes disponíveis neles.</w:t>
+      </w:r>
+    </w:p>
+    <w:p>
+      <w:pPr>
+        <w:numPr>
+          <w:ilvl w:val="0"/>
+          <w:numId w:val="2"/>
+        </w:numPr>
+        <w:spacing w:after="0" w:afterAutospacing="0" w:before="0" w:beforeAutospacing="0" w:line="360" w:lineRule="auto"/>
+        <w:ind w:left="720" w:hanging="360"/>
+      </w:pPr>
+      <w:r>
+        <w:rPr>
+          <w:sz w:val="24"/>
+          <w:szCs w:val="24"/>
+          <w:rtl w:val="0"/>
+        </w:rPr>
+        <w:t xml:space="preserve">O Cliente seleciona os ingredientes faltantes que deseja adquirir.</w:t>
+      </w:r>
+    </w:p>
+    <w:p>
+      <w:pPr>
+        <w:numPr>
+          <w:ilvl w:val="0"/>
+          <w:numId w:val="2"/>
+        </w:numPr>
+        <w:spacing w:after="0" w:afterAutospacing="0" w:before="0" w:beforeAutospacing="0" w:line="360" w:lineRule="auto"/>
+        <w:ind w:left="720" w:hanging="360"/>
+      </w:pPr>
+      <w:r>
+        <w:rPr>
+          <w:sz w:val="24"/>
+          <w:szCs w:val="24"/>
+          <w:rtl w:val="0"/>
+        </w:rPr>
+        <w:t xml:space="preserve">O Cliente clica na opção de "Compra Expressa" (Adicionar ao carrinho).</w:t>
+      </w:r>
+    </w:p>
+    <w:p>
+      <w:pPr>
+        <w:numPr>
+          <w:ilvl w:val="0"/>
+          <w:numId w:val="2"/>
+        </w:numPr>
+        <w:spacing w:after="420" w:before="0" w:beforeAutospacing="0" w:line="360" w:lineRule="auto"/>
+        <w:ind w:left="720" w:hanging="360"/>
+      </w:pPr>
+      <w:r>
+        <w:rPr>
+          <w:sz w:val="24"/>
+          <w:szCs w:val="24"/>
+          <w:rtl w:val="0"/>
+        </w:rPr>
+        <w:t xml:space="preserve">O sistema valida o estoque do item no mercado selecionado e adiciona os produtos ao carrinho de compras do Cliente.</w:t>
+      </w:r>
+    </w:p>
+    <w:p>
+      <w:pPr>
+        <w:spacing w:after="180" w:before="360" w:line="360" w:lineRule="auto"/>
+        <w:jc w:val="both"/>
+        <w:rPr>
+          <w:b w:val="1"/>
+          <w:bCs w:val="1"/>
+          <w:sz w:val="24"/>
+          <w:szCs w:val="24"/>
+        </w:rPr>
+      </w:pPr>
+      <w:r>
+        <w:rPr>
+          <w:b w:val="1"/>
+          <w:bCs w:val="1"/>
+          <w:sz w:val="24"/>
+          <w:szCs w:val="24"/>
+          <w:rtl w:val="0"/>
+        </w:rPr>
+        <w:t xml:space="preserve">Fluxos Alternativos e de Exceção</w:t>
+      </w:r>
+    </w:p>
+    <w:p>
+      <w:pPr>
+        <w:numPr>
+          <w:ilvl w:val="0"/>
+          <w:numId w:val="4"/>
+        </w:numPr>
+        <w:spacing w:after="0" w:afterAutospacing="0" w:before="180" w:line="360" w:lineRule="auto"/>
+        <w:ind w:left="720" w:hanging="360"/>
+      </w:pPr>
+      <w:r>
+        <w:rPr>
+          <w:b w:val="1"/>
+          <w:bCs w:val="1"/>
+          <w:sz w:val="24"/>
+          <w:szCs w:val="24"/>
+          <w:rtl w:val="0"/>
+        </w:rPr>
+        <w:t xml:space="preserve">Fluxo Alternativo 2a: Permissão de GPS negada pelo usuário</w:t>
+      </w:r>
+    </w:p>
+    <w:p>
+      <w:pPr>
+        <w:numPr>
+          <w:ilvl w:val="1"/>
+          <w:numId w:val="4"/>
+        </w:numPr>
+        <w:spacing w:after="0" w:afterAutospacing="0" w:before="0" w:beforeAutospacing="0" w:line="360" w:lineRule="auto"/>
+        <w:ind w:left="1440" w:hanging="360"/>
+      </w:pPr>
+      <w:r>
+        <w:rPr>
+          <w:sz w:val="24"/>
+          <w:szCs w:val="24"/>
+          <w:rtl w:val="0"/>
+        </w:rPr>
+        <w:t xml:space="preserve">O sistema identifica que a permissão de localização foi recusada.</w:t>
+      </w:r>
+    </w:p>
+    <w:p>
+      <w:pPr>
+        <w:numPr>
+          <w:ilvl w:val="1"/>
+          <w:numId w:val="4"/>
+        </w:numPr>
+        <w:spacing w:after="0" w:afterAutospacing="0" w:before="0" w:beforeAutospacing="0" w:line="360" w:lineRule="auto"/>
+        <w:ind w:left="1440" w:hanging="360"/>
+      </w:pPr>
+      <w:r>
+        <w:rPr>
+          <w:sz w:val="24"/>
+          <w:szCs w:val="24"/>
+          <w:rtl w:val="0"/>
+        </w:rPr>
+        <w:t xml:space="preserve">O sistema exibe uma mensagem solicitando que o Cliente insira um endereço manualmente (Ex: CEP ou Nome da Rua).</w:t>
+      </w:r>
+    </w:p>
+    <w:p>
+      <w:pPr>
+        <w:numPr>
+          <w:ilvl w:val="1"/>
+          <w:numId w:val="4"/>
+        </w:numPr>
+        <w:spacing w:after="0" w:afterAutospacing="0" w:before="0" w:beforeAutospacing="0" w:line="360" w:lineRule="auto"/>
+        <w:ind w:left="1440" w:hanging="360"/>
+      </w:pPr>
+      <w:r>
+        <w:rPr>
+          <w:sz w:val="24"/>
+          <w:szCs w:val="24"/>
+          <w:rtl w:val="0"/>
+        </w:rPr>
+        <w:t xml:space="preserve">O Cliente insira o endereço.</w:t>
+      </w:r>
+    </w:p>
+    <w:p>
+      <w:pPr>
+        <w:numPr>
+          <w:ilvl w:val="1"/>
+          <w:numId w:val="4"/>
+        </w:numPr>
+        <w:spacing w:after="0" w:afterAutospacing="0" w:before="0" w:beforeAutospacing="0" w:line="360" w:lineRule="auto"/>
+        <w:ind w:left="1440" w:hanging="360"/>
+      </w:pPr>
+      <w:r>
+        <w:rPr>
+          <w:sz w:val="24"/>
+          <w:szCs w:val="24"/>
+          <w:rtl w:val="0"/>
+        </w:rPr>
+        <w:t xml:space="preserve">O sistema valida o endereço e prossegue para o passo 4 do fluxo principal.</w:t>
+      </w:r>
+    </w:p>
+    <w:p>
+      <w:pPr>
+        <w:numPr>
+          <w:ilvl w:val="0"/>
+          <w:numId w:val="4"/>
+        </w:numPr>
+        <w:spacing w:after="0" w:afterAutospacing="0" w:before="0" w:beforeAutospacing="0" w:line="360" w:lineRule="auto"/>
+        <w:ind w:left="720" w:hanging="360"/>
+      </w:pPr>
+      <w:r>
+        <w:rPr>
+          <w:b w:val="1"/>
+          <w:bCs w:val="1"/>
+          <w:sz w:val="24"/>
+          <w:szCs w:val="24"/>
+          <w:rtl w:val="0"/>
+        </w:rPr>
+        <w:t xml:space="preserve">Fluxo de Exceção 3a: Baixa precisão do sinal de GPS (Raio maior que 50 metros)</w:t>
+      </w:r>
+    </w:p>
+    <w:p>
+      <w:pPr>
+        <w:numPr>
+          <w:ilvl w:val="1"/>
+          <w:numId w:val="4"/>
+        </w:numPr>
+        <w:spacing w:after="0" w:afterAutospacing="0" w:before="0" w:beforeAutospacing="0" w:line="360" w:lineRule="auto"/>
+        <w:ind w:left="1440" w:hanging="360"/>
+      </w:pPr>
+      <w:r>
+        <w:rPr>
+          <w:sz w:val="24"/>
+          <w:szCs w:val="24"/>
+          <w:rtl w:val="0"/>
+        </w:rPr>
+        <w:t xml:space="preserve">O sistema detecta que o sinal do GPS está fraco ou impreciso.</w:t>
+      </w:r>
+    </w:p>
+    <w:p>
+      <w:pPr>
+        <w:numPr>
+          <w:ilvl w:val="1"/>
+          <w:numId w:val="4"/>
+        </w:numPr>
+        <w:spacing w:after="0" w:afterAutospacing="0" w:before="0" w:beforeAutospacing="0" w:line="360" w:lineRule="auto"/>
+        <w:ind w:left="1440" w:hanging="360"/>
+      </w:pPr>
+      <w:r>
+        <w:rPr>
+          <w:sz w:val="24"/>
+          <w:szCs w:val="24"/>
+          <w:rtl w:val="0"/>
+        </w:rPr>
+        <w:t xml:space="preserve">O sistema tenta utilizar métodos complementares (como redes Wi-Fi ou triangulação de antenas) para refinar a posição.</w:t>
+      </w:r>
+    </w:p>
+    <w:p>
+      <w:pPr>
+        <w:numPr>
+          <w:ilvl w:val="1"/>
+          <w:numId w:val="4"/>
+        </w:numPr>
+        <w:spacing w:after="0" w:afterAutospacing="0" w:before="0" w:beforeAutospacing="0" w:line="360" w:lineRule="auto"/>
+        <w:ind w:left="1440" w:hanging="360"/>
+      </w:pPr>
+      <w:r>
+        <w:rPr>
+          <w:sz w:val="24"/>
+          <w:szCs w:val="24"/>
+          <w:rtl w:val="0"/>
+        </w:rPr>
+        <w:t xml:space="preserve">Se ainda assim não atingir a precisão exigida, o sistema notifica o Cliente e solicita a confirmação do endereço na tela antes de prosseguir.</w:t>
+      </w:r>
+    </w:p>
+    <w:p>
+      <w:pPr>
+        <w:numPr>
+          <w:ilvl w:val="0"/>
+          <w:numId w:val="4"/>
+        </w:numPr>
+        <w:spacing w:after="0" w:afterAutospacing="0" w:before="0" w:beforeAutospacing="0" w:line="360" w:lineRule="auto"/>
+        <w:ind w:left="720" w:hanging="360"/>
+      </w:pPr>
+      <w:r>
+        <w:rPr>
+          <w:b w:val="1"/>
+          <w:bCs w:val="1"/>
+          <w:sz w:val="24"/>
+          <w:szCs w:val="24"/>
+          <w:rtl w:val="0"/>
+        </w:rPr>
+        <w:t xml:space="preserve">Fluxo de Exceção 8a: Item indisponível no estoque do mercado parceiro</w:t>
+      </w:r>
+    </w:p>
+    <w:p>
+      <w:pPr>
+        <w:numPr>
+          <w:ilvl w:val="1"/>
+          <w:numId w:val="4"/>
+        </w:numPr>
+        <w:spacing w:after="0" w:afterAutospacing="0" w:before="0" w:beforeAutospacing="0" w:line="360" w:lineRule="auto"/>
+        <w:ind w:left="1440" w:hanging="360"/>
+      </w:pPr>
+      <w:r>
+        <w:rPr>
+          <w:sz w:val="24"/>
+          <w:szCs w:val="24"/>
+          <w:rtl w:val="0"/>
+        </w:rPr>
+        <w:t xml:space="preserve">O sistema identifica que o ingrediente escolhido esgotou no mercado selecionado.</w:t>
+      </w:r>
+    </w:p>
+    <w:p>
+      <w:pPr>
+        <w:numPr>
+          <w:ilvl w:val="1"/>
+          <w:numId w:val="4"/>
+        </w:numPr>
+        <w:spacing w:after="0" w:afterAutospacing="0" w:before="0" w:beforeAutospacing="0" w:line="360" w:lineRule="auto"/>
+        <w:ind w:left="1440" w:hanging="360"/>
+      </w:pPr>
+      <w:r>
+        <w:rPr>
+          <w:sz w:val="24"/>
+          <w:szCs w:val="24"/>
+          <w:rtl w:val="0"/>
+        </w:rPr>
+        <w:t xml:space="preserve">O sistema exibe um aviso informando a indisponibilidade.</w:t>
+      </w:r>
+    </w:p>
+    <w:p>
+      <w:pPr>
+        <w:numPr>
+          <w:ilvl w:val="1"/>
+          <w:numId w:val="4"/>
+        </w:numPr>
+        <w:spacing w:after="480" w:before="0" w:beforeAutospacing="0" w:line="360" w:lineRule="auto"/>
+        <w:ind w:left="1440" w:hanging="360"/>
+      </w:pPr>
+      <w:r>
+        <w:rPr>
+          <w:sz w:val="24"/>
+          <w:szCs w:val="24"/>
+          <w:rtl w:val="0"/>
+        </w:rPr>
+        <w:t xml:space="preserve">O sistema sugere o mercado parceiro mais próximo subsequente que possua o item em estoque.</w:t>
+      </w:r>
+    </w:p>
+    <w:p>
+      <w:pPr>
+        <w:spacing w:line="360" w:lineRule="auto"/>
+        <w:jc w:val="both"/>
+        <w:rPr/>
+      </w:pPr>
+      <w:r>
+        <w:pict>
+          <v:rect style="width:0.0pt;height:1.5pt" o:hr="t" o:hrstd="t" o:hralign="center" fillcolor="#A0A0A0" stroked="f"/>
+        </w:pict>
+      </w:r>
+      <w:r>
+        <w:rPr>
+          <w:rtl w:val="0"/>
+        </w:rPr>
+      </w:r>
+    </w:p>
+    <w:p>
+      <w:pPr>
+        <w:spacing w:line="360" w:lineRule="auto"/>
+        <w:jc w:val="both"/>
+        <w:rPr/>
+      </w:pPr>
+      <w:r>
+        <w:rPr>
+          <w:rtl w:val="0"/>
+        </w:rPr>
+      </w:r>
+    </w:p>
+    <w:p>
+      <w:pPr>
+        <w:spacing w:line="360" w:lineRule="auto"/>
+        <w:jc w:val="both"/>
+        <w:rPr/>
+      </w:pPr>
+      <w:r>
+        <w:rPr>
+          <w:rtl w:val="0"/>
+        </w:rPr>
+        <w:t xml:space="preserve">Caso de Uso Expandido: UC03 – Localizar Mercados e Compra Expressa</w:t>
+      </w:r>
+    </w:p>
+    <w:p>
+      <w:pPr>
+        <w:spacing w:line="360" w:lineRule="auto"/>
+        <w:jc w:val="both"/>
+        <w:rPr/>
+      </w:pPr>
+      <w:r>
+        <w:rPr>
+          <w:rtl w:val="0"/>
+        </w:rPr>
+      </w:r>
+    </w:p>
+    <w:p>
+      <w:pPr>
+        <w:spacing w:line="360" w:lineRule="auto"/>
+        <w:jc w:val="both"/>
+        <w:rPr/>
+      </w:pPr>
+      <w:r>
+        <w:rPr>
+          <w:rtl w:val="0"/>
+        </w:rPr>
+        <w:t xml:space="preserve">• Atores Principais: Cliente (Usuário do app).</w:t>
+      </w:r>
+    </w:p>
+    <w:p>
+      <w:pPr>
+        <w:spacing w:line="360" w:lineRule="auto"/>
+        <w:jc w:val="both"/>
+        <w:rPr/>
+      </w:pPr>
+      <w:r>
+        <w:rPr>
+          <w:rtl w:val="0"/>
+        </w:rPr>
+        <w:t xml:space="preserve">• Atores Secundários: API de Geolocalização (ex: Google Maps / CoreLocation), Sistema de Inventário dos Mercados.</w:t>
+      </w:r>
+    </w:p>
+    <w:p>
+      <w:pPr>
+        <w:spacing w:line="360" w:lineRule="auto"/>
+        <w:jc w:val="both"/>
+        <w:rPr/>
+      </w:pPr>
+      <w:r>
+        <w:rPr>
+          <w:rtl w:val="0"/>
+        </w:rPr>
+        <w:t xml:space="preserve">• Pré-condições: O Cliente deve estar autenticado no sistema e o dispositivo deve estar com o GPS ativado.</w:t>
+      </w:r>
+    </w:p>
+    <w:p>
+      <w:pPr>
+        <w:spacing w:line="360" w:lineRule="auto"/>
+        <w:jc w:val="both"/>
+        <w:rPr/>
+      </w:pPr>
+      <w:r>
+        <w:rPr>
+          <w:rtl w:val="0"/>
+        </w:rPr>
+        <w:t xml:space="preserve">• Pós-condições: Os mercados próximos são exibidos e os itens selecionados são inseridos com sucesso no carrinho de compras.</w:t>
+      </w:r>
+    </w:p>
+    <w:p>
+      <w:pPr>
+        <w:spacing w:line="360" w:lineRule="auto"/>
+        <w:jc w:val="both"/>
+        <w:rPr/>
+      </w:pPr>
+      <w:r>
+        <w:rPr>
+          <w:rtl w:val="0"/>
+        </w:rPr>
+      </w:r>
+    </w:p>
+    <w:p>
+      <w:pPr>
+        <w:spacing w:line="360" w:lineRule="auto"/>
+        <w:jc w:val="both"/>
+        <w:rPr/>
+      </w:pPr>
+      <w:r>
+        <w:rPr>
+          <w:rtl w:val="0"/>
+        </w:rPr>
+        <w:t xml:space="preserve">Fluxo Principal (Cenário de Sucesso)</w:t>
+      </w:r>
+    </w:p>
+    <w:p>
+      <w:pPr>
+        <w:spacing w:line="360" w:lineRule="auto"/>
+        <w:jc w:val="both"/>
+        <w:rPr/>
+      </w:pPr>
+      <w:r>
+        <w:rPr>
+          <w:rtl w:val="0"/>
+        </w:rPr>
+      </w:r>
+    </w:p>
+    <w:p>
+      <w:pPr>
+        <w:spacing w:line="360" w:lineRule="auto"/>
+        <w:jc w:val="both"/>
+        <w:rPr/>
+      </w:pPr>
+      <w:r>
+        <w:rPr>
+          <w:rtl w:val="0"/>
+        </w:rPr>
+        <w:t xml:space="preserve">1. O Cliente acessa a tela de busca de ingredientes ou a área de compras do sistema.</w:t>
+      </w:r>
+    </w:p>
+    <w:p>
+      <w:pPr>
+        <w:spacing w:line="360" w:lineRule="auto"/>
+        <w:jc w:val="both"/>
+        <w:rPr/>
+      </w:pPr>
+      <w:r>
+        <w:rPr>
+          <w:rtl w:val="0"/>
+        </w:rPr>
+        <w:t xml:space="preserve">2. O sistema solicita a geolocalização atual do dispositivo do Cliente através da API de GPS.</w:t>
+      </w:r>
+    </w:p>
+    <w:p>
+      <w:pPr>
+        <w:spacing w:line="360" w:lineRule="auto"/>
+        <w:jc w:val="both"/>
+        <w:rPr/>
+      </w:pPr>
+      <w:r>
+        <w:rPr>
+          <w:rtl w:val="0"/>
+        </w:rPr>
+        <w:t xml:space="preserve">3. O sistema recebe as coordenadas com uma precisão de raio inferior a 50 metros [RFN 03.01].</w:t>
+      </w:r>
+    </w:p>
+    <w:p>
+      <w:pPr>
+        <w:spacing w:line="360" w:lineRule="auto"/>
+        <w:jc w:val="both"/>
+        <w:rPr/>
+      </w:pPr>
+      <w:r>
+        <w:rPr>
+          <w:rtl w:val="0"/>
+        </w:rPr>
+        <w:t xml:space="preserve">4. O sistema consulta a base de dados e identifica os supermercados parceiros credenciados que estão no raio de cobertura daquela localização.</w:t>
+      </w:r>
+    </w:p>
+    <w:p>
+      <w:pPr>
+        <w:spacing w:line="360" w:lineRule="auto"/>
+        <w:jc w:val="both"/>
+        <w:rPr/>
+      </w:pPr>
+      <w:r>
+        <w:rPr>
+          <w:rtl w:val="0"/>
+        </w:rPr>
+        <w:t xml:space="preserve">5. O sistema apresenta ao Cliente a lista de mercados parceiros mais próximos e os produtos/ingredientes disponíveis neles.</w:t>
+      </w:r>
+    </w:p>
+    <w:p>
+      <w:pPr>
+        <w:spacing w:line="360" w:lineRule="auto"/>
+        <w:jc w:val="both"/>
+        <w:rPr/>
+      </w:pPr>
+      <w:r>
+        <w:rPr>
+          <w:rtl w:val="0"/>
+        </w:rPr>
+        <w:t xml:space="preserve">6. O Cliente seleciona os ingredientes faltantes que deseja adquirir.</w:t>
+      </w:r>
+    </w:p>
+    <w:p>
+      <w:pPr>
+        <w:spacing w:line="360" w:lineRule="auto"/>
+        <w:jc w:val="both"/>
+        <w:rPr/>
+      </w:pPr>
+      <w:r>
+        <w:rPr>
+          <w:rtl w:val="0"/>
+        </w:rPr>
+        <w:t xml:space="preserve">7. O Cliente clica na opção de "Compra Expressa" (Adicionar ao carrinho).</w:t>
+      </w:r>
+    </w:p>
+    <w:p>
+      <w:pPr>
+        <w:spacing w:line="360" w:lineRule="auto"/>
+        <w:jc w:val="both"/>
+        <w:rPr/>
+      </w:pPr>
+      <w:r>
+        <w:rPr>
+          <w:rtl w:val="0"/>
+        </w:rPr>
+        <w:t xml:space="preserve">8. O sistema valida o estoque do item no mercado selecionado e adiciona os produtos ao carrinho de compras do Cliente.</w:t>
+      </w:r>
+    </w:p>
+    <w:p>
+      <w:pPr>
+        <w:spacing w:line="360" w:lineRule="auto"/>
+        <w:jc w:val="both"/>
+        <w:rPr/>
+      </w:pPr>
+      <w:r>
+        <w:rPr>
+          <w:rtl w:val="0"/>
+        </w:rPr>
+      </w:r>
+    </w:p>
+    <w:p>
+      <w:pPr>
+        <w:spacing w:line="360" w:lineRule="auto"/>
+        <w:jc w:val="both"/>
+        <w:rPr/>
+      </w:pPr>
+      <w:r>
+        <w:rPr>
+          <w:rtl w:val="0"/>
+        </w:rPr>
+        <w:t xml:space="preserve">Fluxos Alternativos e de Exceção</w:t>
+      </w:r>
+    </w:p>
+    <w:p>
+      <w:pPr>
+        <w:spacing w:line="360" w:lineRule="auto"/>
+        <w:jc w:val="both"/>
+        <w:rPr/>
+      </w:pPr>
+      <w:r>
+        <w:rPr>
+          <w:rtl w:val="0"/>
+        </w:rPr>
+      </w:r>
+    </w:p>
+    <w:p>
+      <w:pPr>
+        <w:spacing w:line="360" w:lineRule="auto"/>
+        <w:jc w:val="both"/>
+        <w:rPr/>
+      </w:pPr>
+      <w:r>
+        <w:rPr>
+          <w:rtl w:val="0"/>
+        </w:rPr>
+        <w:t xml:space="preserve">• Fluxo Alternativo 2a: Permissão de GPS negada pelo usuário</w:t>
+      </w:r>
+    </w:p>
+    <w:p>
+      <w:pPr>
+        <w:spacing w:line="360" w:lineRule="auto"/>
+        <w:jc w:val="both"/>
+        <w:rPr/>
+      </w:pPr>
+      <w:r>
+        <w:rPr>
+          <w:rtl w:val="0"/>
+        </w:rPr>
+        <w:tab/>
+        <w:t xml:space="preserve">1. O sistema identifica que a permissão de localização foi recusada.</w:t>
+      </w:r>
+    </w:p>
+    <w:p>
+      <w:pPr>
+        <w:spacing w:line="360" w:lineRule="auto"/>
+        <w:jc w:val="both"/>
+        <w:rPr/>
+      </w:pPr>
+      <w:r>
+        <w:rPr>
+          <w:rtl w:val="0"/>
+        </w:rPr>
+        <w:tab/>
+        <w:t xml:space="preserve">2. O sistema exibe uma mensagem solicitando que o Cliente insira um endereço manualmente (Ex: CEP ou Nome da Rua).</w:t>
+      </w:r>
+    </w:p>
+    <w:p>
+      <w:pPr>
+        <w:spacing w:line="360" w:lineRule="auto"/>
+        <w:jc w:val="both"/>
+        <w:rPr/>
+      </w:pPr>
+      <w:r>
+        <w:rPr>
+          <w:rtl w:val="0"/>
+        </w:rPr>
+        <w:tab/>
+        <w:t xml:space="preserve">3. O Cliente insira o endereço.</w:t>
+      </w:r>
+    </w:p>
+    <w:p>
+      <w:pPr>
+        <w:spacing w:line="360" w:lineRule="auto"/>
+        <w:jc w:val="both"/>
+        <w:rPr/>
+      </w:pPr>
+      <w:r>
+        <w:rPr>
+          <w:rtl w:val="0"/>
+        </w:rPr>
+        <w:tab/>
+        <w:t xml:space="preserve">4. O sistema valida o endereço e prossegue para o passo 4 do fluxo principal.</w:t>
+      </w:r>
+    </w:p>
+    <w:p>
+      <w:pPr>
+        <w:spacing w:line="360" w:lineRule="auto"/>
+        <w:jc w:val="both"/>
+        <w:rPr/>
+      </w:pPr>
+      <w:r>
+        <w:rPr>
+          <w:rtl w:val="0"/>
+        </w:rPr>
+        <w:t xml:space="preserve">• Fluxo de Exceção 3a: Baixa precisão do sinal de GPS (Raio maior que 50 metros)</w:t>
+      </w:r>
+    </w:p>
+    <w:p>
+      <w:pPr>
+        <w:spacing w:line="360" w:lineRule="auto"/>
+        <w:jc w:val="both"/>
+        <w:rPr/>
+      </w:pPr>
+      <w:r>
+        <w:rPr>
+          <w:rtl w:val="0"/>
+        </w:rPr>
+        <w:tab/>
+        <w:t xml:space="preserve">1. O sistema detecta que o sinal do GPS está fraco ou impreciso.</w:t>
+      </w:r>
+    </w:p>
+    <w:p>
+      <w:pPr>
+        <w:spacing w:line="360" w:lineRule="auto"/>
+        <w:jc w:val="both"/>
+        <w:rPr/>
+      </w:pPr>
+      <w:r>
+        <w:rPr>
+          <w:rtl w:val="0"/>
+        </w:rPr>
+        <w:tab/>
+        <w:t xml:space="preserve">2. O sistema tenta utilizar métodos complementares (como redes Wi-Fi ou triangulação de antenas) para refinar a posição.</w:t>
+      </w:r>
+    </w:p>
+    <w:p>
+      <w:pPr>
+        <w:spacing w:line="360" w:lineRule="auto"/>
+        <w:jc w:val="both"/>
+        <w:rPr/>
+      </w:pPr>
+      <w:r>
+        <w:rPr>
+          <w:rtl w:val="0"/>
+        </w:rPr>
+        <w:tab/>
+        <w:t xml:space="preserve">3. Se ainda assim não atingir a precisão exigida, o sistema notifica o Cliente e solicita a confirmação do endereço na tela antes de prosseguir.</w:t>
+      </w:r>
+    </w:p>
+    <w:p>
+      <w:pPr>
+        <w:spacing w:line="360" w:lineRule="auto"/>
+        <w:jc w:val="both"/>
+        <w:rPr/>
+      </w:pPr>
+      <w:r>
+        <w:rPr>
+          <w:rtl w:val="0"/>
+        </w:rPr>
+        <w:t xml:space="preserve">• Fluxo de Exceção 8a: Item indisponível no estoque do mercado parceiro</w:t>
+      </w:r>
+    </w:p>
+    <w:p>
+      <w:pPr>
+        <w:spacing w:line="360" w:lineRule="auto"/>
+        <w:jc w:val="both"/>
+        <w:rPr/>
+      </w:pPr>
+      <w:r>
+        <w:rPr>
+          <w:rtl w:val="0"/>
+        </w:rPr>
+        <w:tab/>
+        <w:t xml:space="preserve">1. O sistema identifica que o ingrediente escolhido esgotou no mercado selecionado.</w:t>
+      </w:r>
+    </w:p>
+    <w:p>
+      <w:pPr>
+        <w:spacing w:line="360" w:lineRule="auto"/>
+        <w:jc w:val="both"/>
+        <w:rPr/>
+      </w:pPr>
+      <w:r>
+        <w:rPr>
+          <w:rtl w:val="0"/>
+        </w:rPr>
+        <w:tab/>
+        <w:t xml:space="preserve">2. O sistema exibe um aviso informando a indisponibilidade.</w:t>
+      </w:r>
+    </w:p>
+    <w:p>
+      <w:pPr>
+        <w:spacing w:line="360" w:lineRule="auto"/>
+        <w:jc w:val="both"/>
+        <w:rPr/>
+      </w:pPr>
+      <w:r>
+        <w:rPr>
+          <w:rtl w:val="0"/>
+        </w:rPr>
+        <w:tab/>
+        <w:t xml:space="preserve">3. O sistema sugere o mercado parceiro mais próximo subsequente que possua o item em estoque.</w:t>
+      </w:r>
+    </w:p>
+    <w:p>
+      <w:pPr>
+        <w:spacing w:line="360" w:lineRule="auto"/>
+        <w:jc w:val="both"/>
+        <w:rPr/>
+      </w:pPr>
+      <w:r>
+        <w:rPr>
+          <w:rtl w:val="0"/>
+        </w:rPr>
+      </w:r>
+    </w:p>
+    <w:tbl>
+      <w:tblPr>
+        <w:tblStyle w:val="Table6"/>
+        <w:tblW w:w="14010.0" w:type="dxa"/>
+        <w:jc w:val="left"/>
+        <w:tblBorders>
+          <w:top w:color="000000" w:space="0" w:sz="8" w:val="single"/>
+          <w:left w:color="000000" w:space="0" w:sz="8" w:val="single"/>
+          <w:bottom w:color="000000" w:space="0" w:sz="8" w:val="single"/>
+          <w:right w:color="000000" w:space="0" w:sz="8" w:val="single"/>
+          <w:insideH w:color="000000" w:space="0" w:sz="8" w:val="single"/>
+          <w:insideV w:color="000000" w:space="0" w:sz="8" w:val="single"/>
+        </w:tblBorders>
+        <w:tblLayout w:type="fixed"/>
+        <w:tblLook w:val="0600"/>
+      </w:tblPr>
+      <w:tblGrid>
+        <w:gridCol w:w="1905"/>
+        <w:gridCol w:w="12105"/>
+        <w:tblGridChange w:id="0">
+          <w:tblGrid>
+            <w:gridCol w:w="1905"/>
+            <w:gridCol w:w="12105"/>
+          </w:tblGrid>
+        </w:tblGridChange>
+      </w:tblGrid>
+      <w:tr>
+        <w:trPr>
+          <w:cantSplit w:val="0"/>
+          <w:tblHeader w:val="0"/>
+        </w:trPr>
+        <w:tc>
+          <w:tcPr>
+            <w:shd w:fill="auto" w:val="clear"/>
+            <w:tcMar>
+              <w:top w:w="100.0" w:type="dxa"/>
+              <w:left w:w="100.0" w:type="dxa"/>
+              <w:bottom w:w="100.0" w:type="dxa"/>
+              <w:right w:w="100.0" w:type="dxa"/>
+            </w:tcMar>
+            <w:vAlign w:val="top"/>
+          </w:tcPr>
+          <w:p>
+            <w:pPr>
+              <w:widowControl w:val="0"/>
+              <w:spacing w:line="240" w:lineRule="auto"/>
+              <w:rPr/>
+            </w:pPr>
+            <w:r>
+              <w:rPr>
+                <w:b w:val="1"/>
+                <w:bCs w:val="1"/>
+                <w:sz w:val="24"/>
+                <w:szCs w:val="24"/>
+                <w:rtl w:val="0"/>
+              </w:rPr>
+              <w:t xml:space="preserve">CASO DE USO EXPANDIDO-</w:t>
+            </w:r>
+            <w:r>
+              <w:rPr>
+                <w:rtl w:val="0"/>
+              </w:rPr>
+            </w:r>
+          </w:p>
+        </w:tc>
+        <w:tc>
+          <w:tcPr>
+            <w:shd w:fill="auto" w:val="clear"/>
+            <w:tcMar>
+              <w:top w:w="100.0" w:type="dxa"/>
+              <w:left w:w="100.0" w:type="dxa"/>
+              <w:bottom w:w="100.0" w:type="dxa"/>
+              <w:right w:w="100.0" w:type="dxa"/>
+            </w:tcMar>
+            <w:vAlign w:val="top"/>
+          </w:tcPr>
+          <w:p>
+            <w:pPr>
+              <w:keepNext w:val="0"/>
+              <w:keepLines w:val="0"/>
+              <w:pageBreakBefore w:val="0"/>
+              <w:widowControl w:val="0"/>
+              <w:pBdr>
+                <w:top w:space="0" w:sz="0" w:val="nil"/>
+                <w:left w:space="0" w:sz="0" w:val="nil"/>
+                <w:bottom w:space="0" w:sz="0" w:val="nil"/>
+                <w:right w:space="0" w:sz="0" w:val="nil"/>
+                <w:between w:space="0" w:sz="0" w:val="nil"/>
+              </w:pBdr>
+              <w:shd w:fill="auto" w:val="clear"/>
+              <w:spacing w:after="0" w:before="0" w:line="240" w:lineRule="auto"/>
+              <w:ind w:left="0" w:right="0" w:firstLine="0"/>
+              <w:jc w:val="left"/>
+              <w:rPr/>
+            </w:pPr>
+            <w:r>
+              <w:rPr>
+                <w:rtl w:val="0"/>
+              </w:rPr>
+            </w:r>
+          </w:p>
+        </w:tc>
+      </w:tr>
+      <w:tr>
+        <w:trPr>
+          <w:cantSplit w:val="0"/>
+          <w:tblHeader w:val="0"/>
+        </w:trPr>
+        <w:tc>
+          <w:tcPr>
+            <w:shd w:fill="auto" w:val="clear"/>
+            <w:tcMar>
+              <w:top w:w="100.0" w:type="dxa"/>
+              <w:left w:w="100.0" w:type="dxa"/>
+              <w:bottom w:w="100.0" w:type="dxa"/>
+              <w:right w:w="100.0" w:type="dxa"/>
+            </w:tcMar>
+            <w:vAlign w:val="top"/>
+          </w:tcPr>
+          <w:p>
+            <w:pPr>
+              <w:keepNext w:val="0"/>
+              <w:keepLines w:val="0"/>
+              <w:pageBreakBefore w:val="0"/>
+              <w:widowControl w:val="0"/>
+              <w:pBdr>
+                <w:top w:space="0" w:sz="0" w:val="nil"/>
+                <w:left w:space="0" w:sz="0" w:val="nil"/>
+                <w:bottom w:space="0" w:sz="0" w:val="nil"/>
+                <w:right w:space="0" w:sz="0" w:val="nil"/>
+                <w:between w:space="0" w:sz="0" w:val="nil"/>
+              </w:pBdr>
+              <w:shd w:fill="auto" w:val="clear"/>
+              <w:spacing w:after="0" w:before="0" w:line="240" w:lineRule="auto"/>
+              <w:ind w:left="0" w:right="0" w:firstLine="0"/>
+              <w:jc w:val="left"/>
+              <w:rPr/>
+            </w:pPr>
+            <w:r>
+              <w:rPr>
+                <w:rtl w:val="0"/>
+              </w:rPr>
+            </w:r>
+          </w:p>
+        </w:tc>
+        <w:tc>
+          <w:tcPr>
+            <w:shd w:fill="auto" w:val="clear"/>
+            <w:tcMar>
+              <w:top w:w="100.0" w:type="dxa"/>
+              <w:left w:w="100.0" w:type="dxa"/>
+              <w:bottom w:w="100.0" w:type="dxa"/>
+              <w:right w:w="100.0" w:type="dxa"/>
+            </w:tcMar>
+            <w:vAlign w:val="top"/>
+          </w:tcPr>
+          <w:p>
+            <w:pPr>
+              <w:keepNext w:val="0"/>
+              <w:keepLines w:val="0"/>
+              <w:pageBreakBefore w:val="0"/>
+              <w:widowControl w:val="0"/>
+              <w:pBdr>
+                <w:top w:space="0" w:sz="0" w:val="nil"/>
+                <w:left w:space="0" w:sz="0" w:val="nil"/>
+                <w:bottom w:space="0" w:sz="0" w:val="nil"/>
+                <w:right w:space="0" w:sz="0" w:val="nil"/>
+                <w:between w:space="0" w:sz="0" w:val="nil"/>
+              </w:pBdr>
+              <w:shd w:fill="auto" w:val="clear"/>
+              <w:spacing w:after="0" w:before="0" w:line="240" w:lineRule="auto"/>
+              <w:ind w:left="0" w:right="0" w:firstLine="0"/>
+              <w:jc w:val="left"/>
+              <w:rPr/>
+            </w:pPr>
+            <w:r>
+              <w:rPr>
+                <w:rtl w:val="0"/>
+              </w:rPr>
+            </w:r>
+          </w:p>
+        </w:tc>
+      </w:tr>
+      <w:tr>
+        <w:trPr>
+          <w:cantSplit w:val="0"/>
+          <w:tblHeader w:val="0"/>
+        </w:trPr>
+        <w:tc>
+          <w:tcPr>
+            <w:shd w:fill="auto" w:val="clear"/>
+            <w:tcMar>
+              <w:top w:w="100.0" w:type="dxa"/>
+              <w:left w:w="100.0" w:type="dxa"/>
+              <w:bottom w:w="100.0" w:type="dxa"/>
+              <w:right w:w="100.0" w:type="dxa"/>
+            </w:tcMar>
+            <w:vAlign w:val="top"/>
+          </w:tcPr>
+          <w:p>
+            <w:pPr>
+              <w:keepNext w:val="0"/>
+              <w:keepLines w:val="0"/>
+              <w:pageBreakBefore w:val="0"/>
+              <w:widowControl w:val="0"/>
+              <w:pBdr>
+                <w:top w:space="0" w:sz="0" w:val="nil"/>
+                <w:left w:space="0" w:sz="0" w:val="nil"/>
+                <w:bottom w:space="0" w:sz="0" w:val="nil"/>
+                <w:right w:space="0" w:sz="0" w:val="nil"/>
+                <w:between w:space="0" w:sz="0" w:val="nil"/>
+              </w:pBdr>
+              <w:shd w:fill="auto" w:val="clear"/>
+              <w:spacing w:after="0" w:before="0" w:line="240" w:lineRule="auto"/>
+              <w:ind w:left="0" w:right="0" w:firstLine="0"/>
+              <w:jc w:val="left"/>
+              <w:rPr/>
+            </w:pPr>
+            <w:r>
+              <w:rPr>
+                <w:rtl w:val="0"/>
+              </w:rPr>
+            </w:r>
+          </w:p>
+        </w:tc>
+        <w:tc>
+          <w:tcPr>
+            <w:shd w:fill="auto" w:val="clear"/>
+            <w:tcMar>
+              <w:top w:w="100.0" w:type="dxa"/>
+              <w:left w:w="100.0" w:type="dxa"/>
+              <w:bottom w:w="100.0" w:type="dxa"/>
+              <w:right w:w="100.0" w:type="dxa"/>
+            </w:tcMar>
+            <w:vAlign w:val="top"/>
+          </w:tcPr>
+          <w:p>
+            <w:pPr>
+              <w:keepNext w:val="0"/>
+              <w:keepLines w:val="0"/>
+              <w:pageBreakBefore w:val="0"/>
+              <w:widowControl w:val="0"/>
+              <w:pBdr>
+                <w:top w:space="0" w:sz="0" w:val="nil"/>
+                <w:left w:space="0" w:sz="0" w:val="nil"/>
+                <w:bottom w:space="0" w:sz="0" w:val="nil"/>
+                <w:right w:space="0" w:sz="0" w:val="nil"/>
+                <w:between w:space="0" w:sz="0" w:val="nil"/>
+              </w:pBdr>
+              <w:shd w:fill="auto" w:val="clear"/>
+              <w:spacing w:after="0" w:before="0" w:line="240" w:lineRule="auto"/>
+              <w:ind w:left="0" w:right="0" w:firstLine="0"/>
+              <w:jc w:val="left"/>
+              <w:rPr/>
+            </w:pPr>
+            <w:r>
+              <w:rPr>
+                <w:rtl w:val="0"/>
+              </w:rPr>
+            </w:r>
+          </w:p>
+        </w:tc>
+      </w:tr>
+      <w:tr>
+        <w:trPr>
+          <w:cantSplit w:val="0"/>
+          <w:tblHeader w:val="0"/>
+        </w:trPr>
+        <w:tc>
+          <w:tcPr>
+            <w:shd w:fill="auto" w:val="clear"/>
+            <w:tcMar>
+              <w:top w:w="100.0" w:type="dxa"/>
+              <w:left w:w="100.0" w:type="dxa"/>
+              <w:bottom w:w="100.0" w:type="dxa"/>
+              <w:right w:w="100.0" w:type="dxa"/>
+            </w:tcMar>
+            <w:vAlign w:val="top"/>
+          </w:tcPr>
+          <w:p>
+            <w:pPr>
+              <w:keepNext w:val="0"/>
+              <w:keepLines w:val="0"/>
+              <w:pageBreakBefore w:val="0"/>
+              <w:widowControl w:val="0"/>
+              <w:pBdr>
+                <w:top w:space="0" w:sz="0" w:val="nil"/>
+                <w:left w:space="0" w:sz="0" w:val="nil"/>
+                <w:bottom w:space="0" w:sz="0" w:val="nil"/>
+                <w:right w:space="0" w:sz="0" w:val="nil"/>
+                <w:between w:space="0" w:sz="0" w:val="nil"/>
+              </w:pBdr>
+              <w:shd w:fill="auto" w:val="clear"/>
+              <w:spacing w:after="0" w:before="0" w:line="240" w:lineRule="auto"/>
+              <w:ind w:left="0" w:right="0" w:firstLine="0"/>
+              <w:jc w:val="left"/>
+              <w:rPr/>
+            </w:pPr>
+            <w:r>
+              <w:rPr>
+                <w:rtl w:val="0"/>
+              </w:rPr>
+            </w:r>
+          </w:p>
+        </w:tc>
+        <w:tc>
+          <w:tcPr>
+            <w:shd w:fill="auto" w:val="clear"/>
+            <w:tcMar>
+              <w:top w:w="100.0" w:type="dxa"/>
+              <w:left w:w="100.0" w:type="dxa"/>
+              <w:bottom w:w="100.0" w:type="dxa"/>
+              <w:right w:w="100.0" w:type="dxa"/>
+            </w:tcMar>
+            <w:vAlign w:val="top"/>
+          </w:tcPr>
+          <w:p>
+            <w:pPr>
+              <w:keepNext w:val="0"/>
+              <w:keepLines w:val="0"/>
+              <w:pageBreakBefore w:val="0"/>
+              <w:widowControl w:val="0"/>
+              <w:pBdr>
+                <w:top w:space="0" w:sz="0" w:val="nil"/>
+                <w:left w:space="0" w:sz="0" w:val="nil"/>
+                <w:bottom w:space="0" w:sz="0" w:val="nil"/>
+                <w:right w:space="0" w:sz="0" w:val="nil"/>
+                <w:between w:space="0" w:sz="0" w:val="nil"/>
+              </w:pBdr>
+              <w:shd w:fill="auto" w:val="clear"/>
+              <w:spacing w:after="0" w:before="0" w:line="240" w:lineRule="auto"/>
+              <w:ind w:left="0" w:right="0" w:firstLine="0"/>
+              <w:jc w:val="left"/>
+              <w:rPr/>
+            </w:pPr>
+            <w:r>
+              <w:rPr>
+                <w:rtl w:val="0"/>
+              </w:rPr>
+            </w:r>
+          </w:p>
+        </w:tc>
+      </w:tr>
+      <w:tr>
+        <w:trPr>
+          <w:cantSplit w:val="0"/>
+          <w:tblHeader w:val="0"/>
+        </w:trPr>
+        <w:tc>
+          <w:tcPr>
+            <w:shd w:fill="auto" w:val="clear"/>
+            <w:tcMar>
+              <w:top w:w="100.0" w:type="dxa"/>
+              <w:left w:w="100.0" w:type="dxa"/>
+              <w:bottom w:w="100.0" w:type="dxa"/>
+              <w:right w:w="100.0" w:type="dxa"/>
+            </w:tcMar>
+            <w:vAlign w:val="top"/>
+          </w:tcPr>
+          <w:p>
+            <w:pPr>
+              <w:keepNext w:val="0"/>
+              <w:keepLines w:val="0"/>
+              <w:pageBreakBefore w:val="0"/>
+              <w:widowControl w:val="0"/>
+              <w:pBdr>
+                <w:top w:space="0" w:sz="0" w:val="nil"/>
+                <w:left w:space="0" w:sz="0" w:val="nil"/>
+                <w:bottom w:space="0" w:sz="0" w:val="nil"/>
+                <w:right w:space="0" w:sz="0" w:val="nil"/>
+                <w:between w:space="0" w:sz="0" w:val="nil"/>
+              </w:pBdr>
+              <w:shd w:fill="auto" w:val="clear"/>
+              <w:spacing w:after="0" w:before="0" w:line="240" w:lineRule="auto"/>
+              <w:ind w:left="0" w:right="0" w:firstLine="0"/>
+              <w:jc w:val="left"/>
+              <w:rPr/>
+            </w:pPr>
+            <w:r>
+              <w:rPr>
+                <w:rtl w:val="0"/>
+              </w:rPr>
+            </w:r>
+          </w:p>
+        </w:tc>
+        <w:tc>
+          <w:tcPr>
+            <w:shd w:fill="auto" w:val="clear"/>
+            <w:tcMar>
+              <w:top w:w="100.0" w:type="dxa"/>
+              <w:left w:w="100.0" w:type="dxa"/>
+              <w:bottom w:w="100.0" w:type="dxa"/>
+              <w:right w:w="100.0" w:type="dxa"/>
+            </w:tcMar>
+            <w:vAlign w:val="top"/>
+          </w:tcPr>
+          <w:p>
+            <w:pPr>
+              <w:keepNext w:val="0"/>
+              <w:keepLines w:val="0"/>
+              <w:pageBreakBefore w:val="0"/>
+              <w:widowControl w:val="0"/>
+              <w:pBdr>
+                <w:top w:space="0" w:sz="0" w:val="nil"/>
+                <w:left w:space="0" w:sz="0" w:val="nil"/>
+                <w:bottom w:space="0" w:sz="0" w:val="nil"/>
+                <w:right w:space="0" w:sz="0" w:val="nil"/>
+                <w:between w:space="0" w:sz="0" w:val="nil"/>
+              </w:pBdr>
+              <w:shd w:fill="auto" w:val="clear"/>
+              <w:spacing w:after="0" w:before="0" w:line="240" w:lineRule="auto"/>
+              <w:ind w:left="0" w:right="0" w:firstLine="0"/>
+              <w:jc w:val="left"/>
+              <w:rPr/>
+            </w:pPr>
+            <w:r>
+              <w:rPr>
+                <w:rtl w:val="0"/>
+              </w:rPr>
+            </w:r>
+          </w:p>
+        </w:tc>
+      </w:tr>
+      <w:tr>
+        <w:trPr>
+          <w:cantSplit w:val="0"/>
+          <w:tblHeader w:val="0"/>
+        </w:trPr>
+        <w:tc>
+          <w:tcPr>
+            <w:shd w:fill="auto" w:val="clear"/>
+            <w:tcMar>
+              <w:top w:w="100.0" w:type="dxa"/>
+              <w:left w:w="100.0" w:type="dxa"/>
+              <w:bottom w:w="100.0" w:type="dxa"/>
+              <w:right w:w="100.0" w:type="dxa"/>
+            </w:tcMar>
+            <w:vAlign w:val="top"/>
+          </w:tcPr>
+          <w:p>
+            <w:pPr>
+              <w:keepNext w:val="0"/>
+              <w:keepLines w:val="0"/>
+              <w:pageBreakBefore w:val="0"/>
+              <w:widowControl w:val="0"/>
+              <w:pBdr>
+                <w:top w:space="0" w:sz="0" w:val="nil"/>
+                <w:left w:space="0" w:sz="0" w:val="nil"/>
+                <w:bottom w:space="0" w:sz="0" w:val="nil"/>
+                <w:right w:space="0" w:sz="0" w:val="nil"/>
+                <w:between w:space="0" w:sz="0" w:val="nil"/>
+              </w:pBdr>
+              <w:shd w:fill="auto" w:val="clear"/>
+              <w:spacing w:after="0" w:before="0" w:line="240" w:lineRule="auto"/>
+              <w:ind w:left="0" w:right="0" w:firstLine="0"/>
+              <w:jc w:val="left"/>
+              <w:rPr/>
+            </w:pPr>
+            <w:r>
+              <w:rPr>
+                <w:rtl w:val="0"/>
+              </w:rPr>
+            </w:r>
+          </w:p>
+        </w:tc>
+        <w:tc>
+          <w:tcPr>
+            <w:shd w:fill="auto" w:val="clear"/>
+            <w:tcMar>
+              <w:top w:w="100.0" w:type="dxa"/>
+              <w:left w:w="100.0" w:type="dxa"/>
+              <w:bottom w:w="100.0" w:type="dxa"/>
+              <w:right w:w="100.0" w:type="dxa"/>
+            </w:tcMar>
+            <w:vAlign w:val="top"/>
+          </w:tcPr>
+          <w:p>
+            <w:pPr>
+              <w:keepNext w:val="0"/>
+              <w:keepLines w:val="0"/>
+              <w:pageBreakBefore w:val="0"/>
+              <w:widowControl w:val="0"/>
+              <w:pBdr>
+                <w:top w:space="0" w:sz="0" w:val="nil"/>
+                <w:left w:space="0" w:sz="0" w:val="nil"/>
+                <w:bottom w:space="0" w:sz="0" w:val="nil"/>
+                <w:right w:space="0" w:sz="0" w:val="nil"/>
+                <w:between w:space="0" w:sz="0" w:val="nil"/>
+              </w:pBdr>
+              <w:shd w:fill="auto" w:val="clear"/>
+              <w:spacing w:after="0" w:before="0" w:line="240" w:lineRule="auto"/>
+              <w:ind w:left="0" w:right="0" w:firstLine="0"/>
+              <w:jc w:val="left"/>
+              <w:rPr/>
+            </w:pPr>
+            <w:r>
+              <w:rPr>
+                <w:rtl w:val="0"/>
+              </w:rPr>
+            </w:r>
+          </w:p>
+        </w:tc>
+      </w:tr>
+    </w:tbl>
     <w:p>
       <w:pPr>
         <w:spacing w:line="360" w:lineRule="auto"/>
@@ -7171,6 +8723,16 @@
       </w:rPr>
     </w:r>
   </w:p>
+  <w:p>
+    <w:pPr>
+      <w:rPr/>
+    </w:pPr>
+    <w:r>
+      <w:rPr>
+        <w:rtl w:val="0"/>
+      </w:rPr>
+    </w:r>
+  </w:p>
 </w:hdr>
 </file>
 
@@ -7186,6 +8748,12 @@
         <w:ind w:left="720" w:hanging="360"/>
       </w:pPr>
       <w:rPr>
+        <w:rFonts w:ascii="Arial" w:cs="Arial" w:eastAsia="Arial" w:hAnsi="Arial"/>
+        <w:b w:val="0"/>
+        <w:bCs w:val="0"/>
+        <w:strike w:val="0"/>
+        <w:sz w:val="24"/>
+        <w:szCs w:val="24"/>
         <w:u w:val="none"/>
       </w:rPr>
     </w:lvl>
@@ -7289,20 +8857,26 @@
   <w:abstractNum w:abstractNumId="2">
     <w:lvl w:ilvl="0">
       <w:start w:val="1"/>
-      <w:numFmt w:val="bullet"/>
-      <w:lvlText w:val="●"/>
+      <w:numFmt w:val="decimal"/>
+      <w:lvlText w:val="%1."/>
       <w:lvlJc w:val="left"/>
       <w:pPr>
         <w:ind w:left="720" w:hanging="360"/>
       </w:pPr>
       <w:rPr>
+        <w:rFonts w:ascii="Arial" w:cs="Arial" w:eastAsia="Arial" w:hAnsi="Arial"/>
+        <w:b w:val="0"/>
+        <w:bCs w:val="0"/>
+        <w:strike w:val="0"/>
+        <w:sz w:val="24"/>
+        <w:szCs w:val="24"/>
         <w:u w:val="none"/>
       </w:rPr>
     </w:lvl>
     <w:lvl w:ilvl="1">
       <w:start w:val="1"/>
-      <w:numFmt w:val="bullet"/>
-      <w:lvlText w:val="○"/>
+      <w:numFmt w:val="lowerLetter"/>
+      <w:lvlText w:val="%2."/>
       <w:lvlJc w:val="left"/>
       <w:pPr>
         <w:ind w:left="1440" w:hanging="360"/>
@@ -7313,8 +8887,8 @@
     </w:lvl>
     <w:lvl w:ilvl="2">
       <w:start w:val="1"/>
-      <w:numFmt w:val="bullet"/>
-      <w:lvlText w:val="■"/>
+      <w:numFmt w:val="lowerRoman"/>
+      <w:lvlText w:val="%3."/>
       <w:lvlJc w:val="left"/>
       <w:pPr>
         <w:ind w:left="2160" w:hanging="360"/>
@@ -7325,8 +8899,8 @@
     </w:lvl>
     <w:lvl w:ilvl="3">
       <w:start w:val="1"/>
-      <w:numFmt w:val="bullet"/>
-      <w:lvlText w:val="●"/>
+      <w:numFmt w:val="decimal"/>
+      <w:lvlText w:val="%4."/>
       <w:lvlJc w:val="left"/>
       <w:pPr>
         <w:ind w:left="2880" w:hanging="360"/>
@@ -7337,8 +8911,8 @@
     </w:lvl>
     <w:lvl w:ilvl="4">
       <w:start w:val="1"/>
-      <w:numFmt w:val="bullet"/>
-      <w:lvlText w:val="○"/>
+      <w:numFmt w:val="lowerLetter"/>
+      <w:lvlText w:val="%5."/>
       <w:lvlJc w:val="left"/>
       <w:pPr>
         <w:ind w:left="3600" w:hanging="360"/>
@@ -7349,8 +8923,8 @@
     </w:lvl>
     <w:lvl w:ilvl="5">
       <w:start w:val="1"/>
-      <w:numFmt w:val="bullet"/>
-      <w:lvlText w:val="■"/>
+      <w:numFmt w:val="lowerRoman"/>
+      <w:lvlText w:val="%6."/>
       <w:lvlJc w:val="left"/>
       <w:pPr>
         <w:ind w:left="4320" w:hanging="360"/>
@@ -7361,8 +8935,8 @@
     </w:lvl>
     <w:lvl w:ilvl="6">
       <w:start w:val="1"/>
-      <w:numFmt w:val="bullet"/>
-      <w:lvlText w:val="●"/>
+      <w:numFmt w:val="decimal"/>
+      <w:lvlText w:val="%7."/>
       <w:lvlJc w:val="left"/>
       <w:pPr>
         <w:ind w:left="5040" w:hanging="360"/>
@@ -7373,8 +8947,8 @@
     </w:lvl>
     <w:lvl w:ilvl="7">
       <w:start w:val="1"/>
-      <w:numFmt w:val="bullet"/>
-      <w:lvlText w:val="○"/>
+      <w:numFmt w:val="lowerLetter"/>
+      <w:lvlText w:val="%8."/>
       <w:lvlJc w:val="left"/>
       <w:pPr>
         <w:ind w:left="5760" w:hanging="360"/>
@@ -7385,8 +8959,8 @@
     </w:lvl>
     <w:lvl w:ilvl="8">
       <w:start w:val="1"/>
-      <w:numFmt w:val="bullet"/>
-      <w:lvlText w:val="■"/>
+      <w:numFmt w:val="lowerRoman"/>
+      <w:lvlText w:val="%9."/>
       <w:lvlJc w:val="left"/>
       <w:pPr>
         <w:ind w:left="6480" w:hanging="360"/>
@@ -7418,6 +8992,128 @@
         <w:ind w:left="1440" w:hanging="360"/>
       </w:pPr>
       <w:rPr>
+        <w:u w:val="none"/>
+      </w:rPr>
+    </w:lvl>
+    <w:lvl w:ilvl="2">
+      <w:start w:val="1"/>
+      <w:numFmt w:val="bullet"/>
+      <w:lvlText w:val="■"/>
+      <w:lvlJc w:val="left"/>
+      <w:pPr>
+        <w:ind w:left="2160" w:hanging="360"/>
+      </w:pPr>
+      <w:rPr>
+        <w:u w:val="none"/>
+      </w:rPr>
+    </w:lvl>
+    <w:lvl w:ilvl="3">
+      <w:start w:val="1"/>
+      <w:numFmt w:val="bullet"/>
+      <w:lvlText w:val="●"/>
+      <w:lvlJc w:val="left"/>
+      <w:pPr>
+        <w:ind w:left="2880" w:hanging="360"/>
+      </w:pPr>
+      <w:rPr>
+        <w:u w:val="none"/>
+      </w:rPr>
+    </w:lvl>
+    <w:lvl w:ilvl="4">
+      <w:start w:val="1"/>
+      <w:numFmt w:val="bullet"/>
+      <w:lvlText w:val="○"/>
+      <w:lvlJc w:val="left"/>
+      <w:pPr>
+        <w:ind w:left="3600" w:hanging="360"/>
+      </w:pPr>
+      <w:rPr>
+        <w:u w:val="none"/>
+      </w:rPr>
+    </w:lvl>
+    <w:lvl w:ilvl="5">
+      <w:start w:val="1"/>
+      <w:numFmt w:val="bullet"/>
+      <w:lvlText w:val="■"/>
+      <w:lvlJc w:val="left"/>
+      <w:pPr>
+        <w:ind w:left="4320" w:hanging="360"/>
+      </w:pPr>
+      <w:rPr>
+        <w:u w:val="none"/>
+      </w:rPr>
+    </w:lvl>
+    <w:lvl w:ilvl="6">
+      <w:start w:val="1"/>
+      <w:numFmt w:val="bullet"/>
+      <w:lvlText w:val="●"/>
+      <w:lvlJc w:val="left"/>
+      <w:pPr>
+        <w:ind w:left="5040" w:hanging="360"/>
+      </w:pPr>
+      <w:rPr>
+        <w:u w:val="none"/>
+      </w:rPr>
+    </w:lvl>
+    <w:lvl w:ilvl="7">
+      <w:start w:val="1"/>
+      <w:numFmt w:val="bullet"/>
+      <w:lvlText w:val="○"/>
+      <w:lvlJc w:val="left"/>
+      <w:pPr>
+        <w:ind w:left="5760" w:hanging="360"/>
+      </w:pPr>
+      <w:rPr>
+        <w:u w:val="none"/>
+      </w:rPr>
+    </w:lvl>
+    <w:lvl w:ilvl="8">
+      <w:start w:val="1"/>
+      <w:numFmt w:val="bullet"/>
+      <w:lvlText w:val="■"/>
+      <w:lvlJc w:val="left"/>
+      <w:pPr>
+        <w:ind w:left="6480" w:hanging="360"/>
+      </w:pPr>
+      <w:rPr>
+        <w:u w:val="none"/>
+      </w:rPr>
+    </w:lvl>
+  </w:abstractNum>
+  <w:abstractNum w:abstractNumId="4">
+    <w:lvl w:ilvl="0">
+      <w:start w:val="1"/>
+      <w:numFmt w:val="bullet"/>
+      <w:lvlText w:val="●"/>
+      <w:lvlJc w:val="left"/>
+      <w:pPr>
+        <w:ind w:left="720" w:hanging="360"/>
+      </w:pPr>
+      <w:rPr>
+        <w:rFonts w:ascii="Arial" w:cs="Arial" w:eastAsia="Arial" w:hAnsi="Arial"/>
+        <w:b w:val="0"/>
+        <w:bCs w:val="0"/>
+        <w:strike w:val="0"/>
+        <w:sz w:val="24"/>
+        <w:szCs w:val="24"/>
+        <w:u w:val="none"/>
+      </w:rPr>
+    </w:lvl>
+    <w:lvl w:ilvl="1">
+      <w:start w:val="1"/>
+      <w:numFmt w:val="decimal"/>
+      <w:lvlText w:val="%2."/>
+      <w:lvlJc w:val="left"/>
+      <w:pPr>
+        <w:ind w:left="1440" w:hanging="360"/>
+      </w:pPr>
+      <w:rPr>
+        <w:rFonts w:ascii="Arial" w:cs="Arial" w:eastAsia="Arial" w:hAnsi="Arial"/>
+        <w:b w:val="0"/>
+        <w:bCs w:val="0"/>
+        <w:strike w:val="0"/>
+        <w:sz w:val="24"/>
+        <w:szCs w:val="24"/>
         <w:u w:val="none"/>
       </w:rPr>
     </w:lvl>
@@ -7514,6 +9210,9 @@
   </w:num>
   <w:num w:numId="3">
     <w:abstractNumId w:val="3"/>
+  </w:num>
+  <w:num w:numId="4">
+    <w:abstractNumId w:val="4"/>
   </w:num>
 </w:numbering>
 </file>
@@ -7712,6 +9411,13 @@
     </w:tblPr>
   </w:style>
   <w:style w:type="table" w:styleId="Table5">
+    <w:basedOn w:val="TableNormal"/>
+    <w:tblPr>
+      <w:tblStyleRowBandSize w:val="1"/>
+      <w:tblStyleColBandSize w:val="1"/>
+    </w:tblPr>
+  </w:style>
+  <w:style w:type="table" w:styleId="Table6">
     <w:basedOn w:val="TableNormal"/>
     <w:tblPr>
       <w:tblStyleRowBandSize w:val="1"/>

</xml_diff>